<commit_message>
260515 erd, service flow
</commit_message>
<xml_diff>
--- a/jumanchu/planning/광주1반_6조_주만추.docx
+++ b/jumanchu/planning/광주1반_6조_주만추.docx
@@ -8,6 +8,7 @@
         <w:spacing w:after="0"/>
         <w:jc w:val="left"/>
         <w:rPr>
+          <w:rFonts w:hint="eastAsia"/>
           <w:b/>
           <w:bCs/>
           <w:sz w:val="40"/>
@@ -35,120 +36,6 @@
         <w:t>프로젝트 개요</w:t>
       </w:r>
     </w:p>
-    <w:p>
-      <w:pPr>
-        <w:wordWrap/>
-        <w:spacing w:after="0"/>
-        <w:ind w:left="510" w:hanging="510"/>
-        <w:jc w:val="left"/>
-        <w:rPr>
-          <w:sz w:val="22"/>
-          <w:szCs w:val="28"/>
-        </w:rPr>
-      </w:pPr>
-      <w:r>
-        <w:rPr>
-          <w:rFonts w:hint="eastAsia"/>
-          <w:sz w:val="22"/>
-          <w:szCs w:val="28"/>
-        </w:rPr>
-        <w:t xml:space="preserve">서비스의 </w:t>
-      </w:r>
-      <w:r>
-        <w:rPr>
-          <w:rFonts w:hint="eastAsia"/>
-          <w:sz w:val="22"/>
-          <w:szCs w:val="28"/>
-        </w:rPr>
-        <w:t xml:space="preserve">구체적인 목표와 요구사항을 주어진 표의 형태, 또는 다른 </w:t>
-      </w:r>
-      <w:r>
-        <w:rPr>
-          <w:rFonts w:hint="eastAsia"/>
-          <w:sz w:val="22"/>
-          <w:szCs w:val="28"/>
-        </w:rPr>
-        <w:t>양식</w:t>
-      </w:r>
-      <w:r>
-        <w:rPr>
-          <w:rFonts w:hint="eastAsia"/>
-          <w:sz w:val="22"/>
-          <w:szCs w:val="28"/>
-        </w:rPr>
-        <w:t>으</w:t>
-      </w:r>
-      <w:r>
-        <w:rPr>
-          <w:rFonts w:hint="eastAsia"/>
-          <w:sz w:val="22"/>
-          <w:szCs w:val="28"/>
-        </w:rPr>
-        <w:t>로</w:t>
-      </w:r>
-      <w:r>
-        <w:rPr>
-          <w:rFonts w:hint="eastAsia"/>
-          <w:sz w:val="22"/>
-          <w:szCs w:val="28"/>
-        </w:rPr>
-        <w:t xml:space="preserve"> </w:t>
-      </w:r>
-      <w:r>
-        <w:rPr>
-          <w:rFonts w:hint="eastAsia"/>
-          <w:sz w:val="22"/>
-          <w:szCs w:val="28"/>
-        </w:rPr>
-        <w:t>작성할 것</w:t>
-      </w:r>
-    </w:p>
-    <w:p>
-      <w:pPr>
-        <w:pStyle w:val="a4"/>
-        <w:numPr>
-          <w:ilvl w:val="0"/>
-          <w:numId w:val="38"/>
-        </w:numPr>
-        <w:wordWrap/>
-        <w:spacing w:after="0"/>
-        <w:ind w:leftChars="0"/>
-        <w:jc w:val="left"/>
-        <w:rPr>
-          <w:sz w:val="22"/>
-          <w:szCs w:val="28"/>
-        </w:rPr>
-      </w:pPr>
-      <w:r>
-        <w:rPr>
-          <w:rFonts w:hint="eastAsia"/>
-          <w:sz w:val="22"/>
-          <w:szCs w:val="28"/>
-        </w:rPr>
-        <w:t>기능적 요구사항과 비기능적 요구사항을 분리하여 작성</w:t>
-      </w:r>
-    </w:p>
-    <w:p>
-      <w:pPr>
-        <w:pStyle w:val="a4"/>
-        <w:numPr>
-          <w:ilvl w:val="0"/>
-          <w:numId w:val="38"/>
-        </w:numPr>
-        <w:wordWrap/>
-        <w:spacing w:after="0"/>
-        <w:ind w:leftChars="0"/>
-        <w:jc w:val="left"/>
-      </w:pPr>
-      <w:r>
-        <w:rPr>
-          <w:rFonts w:hint="eastAsia"/>
-          <w:sz w:val="22"/>
-          <w:szCs w:val="28"/>
-        </w:rPr>
-        <w:t>팀의 서비스 가능 목록을 최대한 세분화하여 작성할 것</w:t>
-      </w:r>
-    </w:p>
     <w:tbl>
       <w:tblPr>
         <w:tblStyle w:val="a3"/>
@@ -536,6 +423,39 @@
               <w:t>뉴스</w:t>
             </w:r>
             <w:r>
+              <w:rPr>
+                <w:rFonts w:hint="eastAsia"/>
+              </w:rPr>
+              <w:t>,</w:t>
+            </w:r>
+            <w:r>
+              <w:t xml:space="preserve"> </w:t>
+            </w:r>
+            <w:r>
+              <w:rPr>
+                <w:rFonts w:hint="eastAsia"/>
+              </w:rPr>
+              <w:t>투자 성향,</w:t>
+            </w:r>
+            <w:r>
+              <w:t xml:space="preserve"> </w:t>
+            </w:r>
+            <w:r>
+              <w:rPr>
+                <w:rFonts w:hint="eastAsia"/>
+              </w:rPr>
+              <w:t>관심 종목,</w:t>
+            </w:r>
+            <w:r>
+              <w:t xml:space="preserve"> </w:t>
+            </w:r>
+            <w:r>
+              <w:rPr>
+                <w:rFonts w:hint="eastAsia"/>
+              </w:rPr>
+              <w:t>매매일기</w:t>
+            </w:r>
+            <w:r>
               <w:t xml:space="preserve"> 기반 </w:t>
             </w:r>
             <w:proofErr w:type="spellStart"/>
@@ -690,26 +610,98 @@
                 <w:szCs w:val="20"/>
               </w:rPr>
             </w:pPr>
-            <w:proofErr w:type="gramStart"/>
-            <w:r>
-              <w:rPr>
-                <w:szCs w:val="20"/>
-              </w:rPr>
-              <w:t>홈 /</w:t>
-            </w:r>
-            <w:proofErr w:type="gramEnd"/>
-            <w:r>
-              <w:rPr>
+            <w:r>
+              <w:rPr>
+                <w:szCs w:val="20"/>
+              </w:rPr>
+              <w:t xml:space="preserve">홈 / </w:t>
+            </w:r>
+            <w:r>
+              <w:rPr>
+                <w:rFonts w:hint="eastAsia"/>
+                <w:szCs w:val="20"/>
+              </w:rPr>
+              <w:t xml:space="preserve">커뮤니티 </w:t>
+            </w:r>
+            <w:r>
+              <w:rPr>
+                <w:szCs w:val="20"/>
+              </w:rPr>
+              <w:t xml:space="preserve">/ </w:t>
+            </w:r>
+            <w:r>
+              <w:rPr>
+                <w:rFonts w:hint="eastAsia"/>
+                <w:szCs w:val="20"/>
+              </w:rPr>
+              <w:t xml:space="preserve">게시글 </w:t>
+            </w:r>
+            <w:r>
+              <w:rPr>
+                <w:szCs w:val="20"/>
+              </w:rPr>
+              <w:t>/ 프로</w:t>
+            </w:r>
+            <w:r>
+              <w:rPr>
+                <w:rFonts w:hint="eastAsia"/>
+                <w:szCs w:val="20"/>
+              </w:rPr>
+              <w:t xml:space="preserve">필 / </w:t>
+            </w:r>
+            <w:r>
+              <w:rPr>
+                <w:rFonts w:hint="eastAsia"/>
+                <w:szCs w:val="20"/>
+              </w:rPr>
+              <w:t>주식</w:t>
+            </w:r>
+            <w:r>
+              <w:rPr>
+                <w:rFonts w:hint="eastAsia"/>
+                <w:szCs w:val="20"/>
+              </w:rPr>
+              <w:t xml:space="preserve"> 목록 / </w:t>
+            </w:r>
+            <w:r>
+              <w:rPr>
+                <w:rFonts w:hint="eastAsia"/>
+                <w:szCs w:val="20"/>
+              </w:rPr>
+              <w:t xml:space="preserve">종목 상세 페이지 </w:t>
+            </w:r>
+            <w:r>
+              <w:rPr>
+                <w:szCs w:val="20"/>
+              </w:rPr>
+              <w:t xml:space="preserve">/ </w:t>
+            </w:r>
+            <w:r>
+              <w:rPr>
+                <w:rFonts w:hint="eastAsia"/>
+                <w:szCs w:val="20"/>
+              </w:rPr>
+              <w:t>일기장</w:t>
+            </w:r>
+            <w:r>
+              <w:rPr>
+                <w:rFonts w:hint="eastAsia"/>
                 <w:szCs w:val="20"/>
               </w:rPr>
               <w:t xml:space="preserve"> </w:t>
             </w:r>
             <w:r>
               <w:rPr>
+                <w:szCs w:val="20"/>
+              </w:rPr>
+              <w:t xml:space="preserve">/ </w:t>
+            </w:r>
+            <w:r>
+              <w:rPr>
                 <w:rFonts w:hint="eastAsia"/>
                 <w:szCs w:val="20"/>
               </w:rPr>
-              <w:t xml:space="preserve">커뮤니티 </w:t>
+              <w:t xml:space="preserve">뉴스 </w:t>
             </w:r>
             <w:r>
               <w:rPr>
@@ -722,54 +714,7 @@
                 <w:rFonts w:hint="eastAsia"/>
                 <w:szCs w:val="20"/>
               </w:rPr>
-              <w:t xml:space="preserve">게시글 </w:t>
-            </w:r>
-            <w:r>
-              <w:rPr>
-                <w:szCs w:val="20"/>
-              </w:rPr>
-              <w:t>/ 프로</w:t>
-            </w:r>
-            <w:r>
-              <w:rPr>
-                <w:rFonts w:hint="eastAsia"/>
-                <w:szCs w:val="20"/>
-              </w:rPr>
-              <w:t xml:space="preserve">필 / </w:t>
-            </w:r>
-            <w:r>
-              <w:rPr>
-                <w:rFonts w:hint="eastAsia"/>
-                <w:szCs w:val="20"/>
-              </w:rPr>
-              <w:t>주식</w:t>
-            </w:r>
-            <w:r>
-              <w:rPr>
-                <w:rFonts w:hint="eastAsia"/>
-                <w:szCs w:val="20"/>
-              </w:rPr>
-              <w:t xml:space="preserve"> 목록 / </w:t>
-            </w:r>
-            <w:r>
-              <w:rPr>
-                <w:rFonts w:hint="eastAsia"/>
-                <w:szCs w:val="20"/>
-              </w:rPr>
-              <w:t xml:space="preserve">종목 상세 페이지 </w:t>
-            </w:r>
-            <w:r>
-              <w:rPr>
-                <w:szCs w:val="20"/>
-              </w:rPr>
-              <w:t xml:space="preserve">/ </w:t>
-            </w:r>
-            <w:r>
-              <w:rPr>
-                <w:rFonts w:hint="eastAsia"/>
-                <w:szCs w:val="20"/>
-              </w:rPr>
-              <w:t>일기장</w:t>
+              <w:t>캘린더</w:t>
             </w:r>
           </w:p>
         </w:tc>
@@ -2073,7 +2018,6 @@
                 <w:kern w:val="0"/>
                 <w:szCs w:val="20"/>
               </w:rPr>
-              <w:lastRenderedPageBreak/>
               <w:t>F0</w:t>
             </w:r>
             <w:r>
@@ -2350,6 +2294,7 @@
                 <w:kern w:val="0"/>
                 <w:szCs w:val="20"/>
               </w:rPr>
+              <w:lastRenderedPageBreak/>
               <w:t>F</w:t>
             </w:r>
             <w:r>
@@ -2908,7 +2853,25 @@
                 <w:kern w:val="0"/>
                 <w:szCs w:val="20"/>
               </w:rPr>
-              <w:t xml:space="preserve"> 인터넷 환경에서 모든 화면 전환 작업은 6초 이내에 이뤄져야 함</w:t>
+              <w:t xml:space="preserve"> 인터넷 환경에서 모든 화면 전환 작업은 </w:t>
+            </w:r>
+            <w:r>
+              <w:rPr>
+                <w:rFonts w:eastAsiaTheme="minorHAnsi" w:cs="AppleSDGothicNeo-Regular"/>
+                <w:color w:val="333333"/>
+                <w:kern w:val="0"/>
+                <w:szCs w:val="20"/>
+              </w:rPr>
+              <w:t>3</w:t>
+            </w:r>
+            <w:r>
+              <w:rPr>
+                <w:rFonts w:eastAsiaTheme="minorHAnsi" w:cs="AppleSDGothicNeo-Regular" w:hint="eastAsia"/>
+                <w:color w:val="333333"/>
+                <w:kern w:val="0"/>
+                <w:szCs w:val="20"/>
+              </w:rPr>
+              <w:t>초 이내에 이뤄져야 함</w:t>
             </w:r>
           </w:p>
         </w:tc>
@@ -3821,9 +3784,6 @@
         <w:wordWrap/>
         <w:autoSpaceDE/>
         <w:autoSpaceDN/>
-        <w:rPr>
-          <w:rFonts w:hint="eastAsia"/>
-        </w:rPr>
       </w:pPr>
       <w:r>
         <w:br w:type="page"/>
@@ -3980,7 +3940,21 @@
           <w:rFonts w:ascii="맑은 고딕" w:eastAsia="맑은 고딕" w:hAnsi="맑은 고딕" w:cs="맑은 고딕"/>
           <w:sz w:val="22"/>
         </w:rPr>
-        <w:t xml:space="preserve"> 위한 주식투자 서비스</w:t>
+        <w:t xml:space="preserve"> 위한 주식투자</w:t>
+      </w:r>
+      <w:r>
+        <w:rPr>
+          <w:rFonts w:ascii="맑은 고딕" w:eastAsia="맑은 고딕" w:hAnsi="맑은 고딕" w:cs="맑은 고딕" w:hint="eastAsia"/>
+          <w:sz w:val="22"/>
+        </w:rPr>
+        <w:t xml:space="preserve"> 습관 형성</w:t>
+      </w:r>
+      <w:r>
+        <w:rPr>
+          <w:rFonts w:ascii="맑은 고딕" w:eastAsia="맑은 고딕" w:hAnsi="맑은 고딕" w:cs="맑은 고딕"/>
+          <w:sz w:val="22"/>
+        </w:rPr>
+        <w:t xml:space="preserve"> 서비스</w:t>
       </w:r>
     </w:p>
     <w:p>
@@ -4001,23 +3975,7 @@
           <w:rFonts w:ascii="맑은 고딕" w:eastAsia="맑은 고딕" w:hAnsi="맑은 고딕" w:cs="맑은 고딕"/>
           <w:sz w:val="22"/>
         </w:rPr>
-        <w:t>2026-05-11 (월) ~ 2026-06-25 (목</w:t>
-      </w:r>
-      <w:proofErr w:type="gramStart"/>
-      <w:r>
-        <w:rPr>
-          <w:rFonts w:ascii="맑은 고딕" w:eastAsia="맑은 고딕" w:hAnsi="맑은 고딕" w:cs="맑은 고딕"/>
-          <w:sz w:val="22"/>
-        </w:rPr>
-        <w:t>)  |</w:t>
-      </w:r>
-      <w:proofErr w:type="gramEnd"/>
-      <w:r>
-        <w:rPr>
-          <w:rFonts w:ascii="맑은 고딕" w:eastAsia="맑은 고딕" w:hAnsi="맑은 고딕" w:cs="맑은 고딕"/>
-          <w:sz w:val="22"/>
-        </w:rPr>
-        <w:t xml:space="preserve">  마감: 6/20  |  발표: 6/25</w:t>
+        <w:t>2026-05-11 (월) ~ 2026-06-25 (목)  |  마감: 6/20  |  발표: 6/25</w:t>
       </w:r>
     </w:p>
     <w:p>
@@ -4064,6 +4022,29 @@
       <w:proofErr w:type="spellEnd"/>
       <w:r>
         <w:rPr>
+          <w:rFonts w:ascii="맑은 고딕" w:eastAsia="맑은 고딕" w:hAnsi="맑은 고딕" w:cs="맑은 고딕" w:hint="eastAsia"/>
+          <w:sz w:val="22"/>
+        </w:rPr>
+        <w:t>,</w:t>
+      </w:r>
+      <w:r>
+        <w:rPr>
+          <w:rFonts w:ascii="맑은 고딕" w:eastAsia="맑은 고딕" w:hAnsi="맑은 고딕" w:cs="맑은 고딕"/>
+          <w:sz w:val="22"/>
+        </w:rPr>
+        <w:t xml:space="preserve"> </w:t>
+      </w:r>
+      <w:proofErr w:type="spellStart"/>
+      <w:r>
+        <w:rPr>
+          <w:rFonts w:ascii="맑은 고딕" w:eastAsia="맑은 고딕" w:hAnsi="맑은 고딕" w:cs="맑은 고딕" w:hint="eastAsia"/>
+          <w:sz w:val="22"/>
+        </w:rPr>
+        <w:t>정율</w:t>
+      </w:r>
+      <w:proofErr w:type="spellEnd"/>
+      <w:r>
+        <w:rPr>
           <w:rFonts w:ascii="맑은 고딕" w:eastAsia="맑은 고딕" w:hAnsi="맑은 고딕" w:cs="맑은 고딕"/>
           <w:sz w:val="22"/>
         </w:rPr>
@@ -4075,6 +4056,9 @@
         <w:spacing w:after="300"/>
       </w:pPr>
       <w:r>
+        <w:rPr>
+          <w:noProof/>
+        </w:rPr>
         <w:drawing>
           <wp:inline distT="0" distB="0" distL="0" distR="0" wp14:anchorId="47A216B3" wp14:editId="085E2675">
             <wp:extent cx="5731510" cy="6003925"/>
@@ -4289,7 +4273,7 @@
       <w:pPr>
         <w:spacing w:before="200" w:after="100"/>
         <w:rPr>
-          <w:rFonts w:ascii="맑은 고딕" w:eastAsia="맑은 고딕" w:hAnsi="맑은 고딕" w:cs="맑은 고딕" w:hint="eastAsia"/>
+          <w:rFonts w:ascii="맑은 고딕" w:eastAsia="맑은 고딕" w:hAnsi="맑은 고딕" w:cs="맑은 고딕"/>
           <w:b/>
           <w:bCs/>
           <w:sz w:val="22"/>
@@ -4358,12 +4342,6 @@
         <w:gridCol w:w="1926"/>
       </w:tblGrid>
       <w:tr>
-        <w:tblPrEx>
-          <w:tblCellMar>
-            <w:top w:w="0" w:type="dxa"/>
-            <w:bottom w:w="0" w:type="dxa"/>
-          </w:tblCellMar>
-        </w:tblPrEx>
         <w:trPr>
           <w:tblHeader/>
           <w:jc w:val="center"/>
@@ -4545,12 +4523,6 @@
         </w:tc>
       </w:tr>
       <w:tr>
-        <w:tblPrEx>
-          <w:tblCellMar>
-            <w:top w:w="0" w:type="dxa"/>
-            <w:bottom w:w="0" w:type="dxa"/>
-          </w:tblCellMar>
-        </w:tblPrEx>
         <w:trPr>
           <w:jc w:val="center"/>
         </w:trPr>
@@ -4863,12 +4835,6 @@
         </w:tc>
       </w:tr>
       <w:tr>
-        <w:tblPrEx>
-          <w:tblCellMar>
-            <w:top w:w="0" w:type="dxa"/>
-            <w:bottom w:w="0" w:type="dxa"/>
-          </w:tblCellMar>
-        </w:tblPrEx>
         <w:trPr>
           <w:jc w:val="center"/>
         </w:trPr>
@@ -5179,12 +5145,6 @@
         </w:tc>
       </w:tr>
       <w:tr>
-        <w:tblPrEx>
-          <w:tblCellMar>
-            <w:top w:w="0" w:type="dxa"/>
-            <w:bottom w:w="0" w:type="dxa"/>
-          </w:tblCellMar>
-        </w:tblPrEx>
         <w:trPr>
           <w:jc w:val="center"/>
         </w:trPr>
@@ -5375,12 +5335,6 @@
         </w:tc>
       </w:tr>
       <w:tr>
-        <w:tblPrEx>
-          <w:tblCellMar>
-            <w:top w:w="0" w:type="dxa"/>
-            <w:bottom w:w="0" w:type="dxa"/>
-          </w:tblCellMar>
-        </w:tblPrEx>
         <w:trPr>
           <w:jc w:val="center"/>
         </w:trPr>
@@ -5583,12 +5537,6 @@
         </w:tc>
       </w:tr>
       <w:tr>
-        <w:tblPrEx>
-          <w:tblCellMar>
-            <w:top w:w="0" w:type="dxa"/>
-            <w:bottom w:w="0" w:type="dxa"/>
-          </w:tblCellMar>
-        </w:tblPrEx>
         <w:trPr>
           <w:jc w:val="center"/>
         </w:trPr>
@@ -5796,12 +5744,6 @@
         </w:tc>
       </w:tr>
       <w:tr>
-        <w:tblPrEx>
-          <w:tblCellMar>
-            <w:top w:w="0" w:type="dxa"/>
-            <w:bottom w:w="0" w:type="dxa"/>
-          </w:tblCellMar>
-        </w:tblPrEx>
         <w:trPr>
           <w:jc w:val="center"/>
         </w:trPr>
@@ -5827,17 +5769,21 @@
             <w:pPr>
               <w:spacing w:after="0" w:line="280" w:lineRule="auto"/>
               <w:jc w:val="center"/>
+              <w:rPr>
+                <w:strike/>
+              </w:rPr>
             </w:pPr>
             <w:r>
               <w:rPr>
                 <w:rFonts w:ascii="맑은 고딕" w:eastAsia="맑은 고딕" w:hAnsi="맑은 고딕" w:cs="맑은 고딕"/>
                 <w:b/>
                 <w:bCs/>
+                <w:strike/>
                 <w:color w:val="333333"/>
                 <w:sz w:val="18"/>
                 <w:szCs w:val="18"/>
               </w:rPr>
-              <w:t>한국 뉴스 빅데이터</w:t>
+              <w:t>한국 종목 실시간 뉴스</w:t>
             </w:r>
           </w:p>
         </w:tc>
@@ -5862,15 +5808,31 @@
           <w:p>
             <w:pPr>
               <w:spacing w:after="0" w:line="280" w:lineRule="auto"/>
-            </w:pPr>
+              <w:rPr>
+                <w:strike/>
+              </w:rPr>
+            </w:pPr>
+            <w:proofErr w:type="spellStart"/>
             <w:r>
               <w:rPr>
                 <w:rFonts w:ascii="맑은 고딕" w:eastAsia="맑은 고딕" w:hAnsi="맑은 고딕" w:cs="맑은 고딕"/>
+                <w:strike/>
                 <w:color w:val="333333"/>
                 <w:sz w:val="18"/>
                 <w:szCs w:val="18"/>
               </w:rPr>
-              <w:t>54개 언론사 통합 뉴스 데이터, 키워드 트렌드 분석, 종목 매칭</w:t>
+              <w:t>종목명</w:t>
+            </w:r>
+            <w:proofErr w:type="spellEnd"/>
+            <w:r>
+              <w:rPr>
+                <w:rFonts w:ascii="맑은 고딕" w:eastAsia="맑은 고딕" w:hAnsi="맑은 고딕" w:cs="맑은 고딕"/>
+                <w:strike/>
+                <w:color w:val="333333"/>
+                <w:sz w:val="18"/>
+                <w:szCs w:val="18"/>
+              </w:rPr>
+              <w:t>/키워드 기반 한국어 뉴스 (제목, 요약, URL, 발행일)</w:t>
             </w:r>
           </w:p>
         </w:tc>
@@ -5896,61 +5858,19 @@
             <w:pPr>
               <w:spacing w:after="0" w:line="280" w:lineRule="auto"/>
               <w:jc w:val="center"/>
+              <w:rPr>
+                <w:strike/>
+              </w:rPr>
             </w:pPr>
             <w:r>
               <w:rPr>
                 <w:rFonts w:ascii="맑은 고딕" w:eastAsia="맑은 고딕" w:hAnsi="맑은 고딕" w:cs="맑은 고딕"/>
+                <w:strike/>
                 <w:color w:val="333333"/>
                 <w:sz w:val="18"/>
                 <w:szCs w:val="18"/>
               </w:rPr>
-              <w:t>한국언론진흥재단</w:t>
-            </w:r>
-          </w:p>
-          <w:p>
-            <w:pPr>
-              <w:spacing w:after="0" w:line="280" w:lineRule="auto"/>
-              <w:jc w:val="center"/>
-            </w:pPr>
-            <w:proofErr w:type="spellStart"/>
-            <w:r>
-              <w:rPr>
-                <w:rFonts w:ascii="맑은 고딕" w:eastAsia="맑은 고딕" w:hAnsi="맑은 고딕" w:cs="맑은 고딕"/>
-                <w:color w:val="333333"/>
-                <w:sz w:val="18"/>
-                <w:szCs w:val="18"/>
-              </w:rPr>
-              <w:t>빅카인즈</w:t>
-            </w:r>
-            <w:proofErr w:type="spellEnd"/>
-            <w:r>
-              <w:rPr>
-                <w:rFonts w:ascii="맑은 고딕" w:eastAsia="맑은 고딕" w:hAnsi="맑은 고딕" w:cs="맑은 고딕"/>
-                <w:color w:val="333333"/>
-                <w:sz w:val="18"/>
-                <w:szCs w:val="18"/>
-              </w:rPr>
-              <w:t xml:space="preserve"> (</w:t>
-            </w:r>
-            <w:proofErr w:type="spellStart"/>
-            <w:r>
-              <w:rPr>
-                <w:rFonts w:ascii="맑은 고딕" w:eastAsia="맑은 고딕" w:hAnsi="맑은 고딕" w:cs="맑은 고딕"/>
-                <w:color w:val="333333"/>
-                <w:sz w:val="18"/>
-                <w:szCs w:val="18"/>
-              </w:rPr>
-              <w:t>BigKinds</w:t>
-            </w:r>
-            <w:proofErr w:type="spellEnd"/>
-            <w:r>
-              <w:rPr>
-                <w:rFonts w:ascii="맑은 고딕" w:eastAsia="맑은 고딕" w:hAnsi="맑은 고딕" w:cs="맑은 고딕"/>
-                <w:color w:val="333333"/>
-                <w:sz w:val="18"/>
-                <w:szCs w:val="18"/>
-              </w:rPr>
-              <w:t>)</w:t>
+              <w:t>네이버 검색 API</w:t>
             </w:r>
           </w:p>
         </w:tc>
@@ -5976,10 +5896,14 @@
             <w:pPr>
               <w:spacing w:after="0" w:line="280" w:lineRule="auto"/>
               <w:jc w:val="center"/>
+              <w:rPr>
+                <w:strike/>
+              </w:rPr>
             </w:pPr>
             <w:r>
               <w:rPr>
                 <w:rFonts w:ascii="맑은 고딕" w:eastAsia="맑은 고딕" w:hAnsi="맑은 고딕" w:cs="맑은 고딕"/>
+                <w:strike/>
                 <w:color w:val="333333"/>
                 <w:sz w:val="18"/>
                 <w:szCs w:val="18"/>
@@ -5991,15 +5915,19 @@
             <w:pPr>
               <w:spacing w:after="0" w:line="280" w:lineRule="auto"/>
               <w:jc w:val="center"/>
+              <w:rPr>
+                <w:strike/>
+              </w:rPr>
             </w:pPr>
             <w:r>
               <w:rPr>
                 <w:rFonts w:ascii="맑은 고딕" w:eastAsia="맑은 고딕" w:hAnsi="맑은 고딕" w:cs="맑은 고딕"/>
+                <w:strike/>
                 <w:color w:val="333333"/>
                 <w:sz w:val="18"/>
                 <w:szCs w:val="18"/>
               </w:rPr>
-              <w:t>(승인 후 사용)</w:t>
+              <w:t>(일 25,000회 무료)</w:t>
             </w:r>
           </w:p>
         </w:tc>
@@ -6024,37 +5952,24 @@
           <w:p>
             <w:pPr>
               <w:spacing w:after="0" w:line="280" w:lineRule="auto"/>
-            </w:pPr>
-            <w:proofErr w:type="spellStart"/>
+              <w:rPr>
+                <w:strike/>
+              </w:rPr>
+            </w:pPr>
             <w:r>
               <w:rPr>
                 <w:rFonts w:ascii="맑은 고딕" w:eastAsia="맑은 고딕" w:hAnsi="맑은 고딕" w:cs="맑은 고딕"/>
+                <w:strike/>
                 <w:color w:val="333333"/>
                 <w:sz w:val="18"/>
                 <w:szCs w:val="18"/>
               </w:rPr>
-              <w:t>트렌딩</w:t>
-            </w:r>
-            <w:proofErr w:type="spellEnd"/>
-            <w:r>
-              <w:rPr>
-                <w:rFonts w:ascii="맑은 고딕" w:eastAsia="맑은 고딕" w:hAnsi="맑은 고딕" w:cs="맑은 고딕"/>
-                <w:color w:val="333333"/>
-                <w:sz w:val="18"/>
-                <w:szCs w:val="18"/>
-              </w:rPr>
-              <w:t xml:space="preserve"> 키워드 TOP 10, 키워드 기반 종목 추천</w:t>
+              <w:t>한국 종목 상세 페이지 뉴스 탭</w:t>
             </w:r>
           </w:p>
         </w:tc>
       </w:tr>
       <w:tr>
-        <w:tblPrEx>
-          <w:tblCellMar>
-            <w:top w:w="0" w:type="dxa"/>
-            <w:bottom w:w="0" w:type="dxa"/>
-          </w:tblCellMar>
-        </w:tblPrEx>
         <w:trPr>
           <w:jc w:val="center"/>
         </w:trPr>
@@ -6090,7 +6005,7 @@
                 <w:sz w:val="18"/>
                 <w:szCs w:val="18"/>
               </w:rPr>
-              <w:t>한국 종목 실시간 뉴스</w:t>
+              <w:t>미국 종목 영문 뉴스</w:t>
             </w:r>
           </w:p>
         </w:tc>
@@ -6116,7 +6031,6 @@
             <w:pPr>
               <w:spacing w:after="0" w:line="280" w:lineRule="auto"/>
             </w:pPr>
-            <w:proofErr w:type="spellStart"/>
             <w:r>
               <w:rPr>
                 <w:rFonts w:ascii="맑은 고딕" w:eastAsia="맑은 고딕" w:hAnsi="맑은 고딕" w:cs="맑은 고딕"/>
@@ -6124,9 +6038,9 @@
                 <w:sz w:val="18"/>
                 <w:szCs w:val="18"/>
               </w:rPr>
-              <w:t>종목명</w:t>
-            </w:r>
-            <w:proofErr w:type="spellEnd"/>
+              <w:t xml:space="preserve">미국 </w:t>
+            </w:r>
+            <w:proofErr w:type="spellStart"/>
             <w:r>
               <w:rPr>
                 <w:rFonts w:ascii="맑은 고딕" w:eastAsia="맑은 고딕" w:hAnsi="맑은 고딕" w:cs="맑은 고딕"/>
@@ -6134,7 +6048,37 @@
                 <w:sz w:val="18"/>
                 <w:szCs w:val="18"/>
               </w:rPr>
-              <w:t>/키워드 기반 한국어 뉴스 (제목, 요약, URL, 발행일)</w:t>
+              <w:t>종목명</w:t>
+            </w:r>
+            <w:proofErr w:type="spellEnd"/>
+            <w:r>
+              <w:rPr>
+                <w:rFonts w:ascii="맑은 고딕" w:eastAsia="맑은 고딕" w:hAnsi="맑은 고딕" w:cs="맑은 고딕"/>
+                <w:color w:val="333333"/>
+                <w:sz w:val="18"/>
+                <w:szCs w:val="18"/>
+              </w:rPr>
+              <w:t>/</w:t>
+            </w:r>
+            <w:proofErr w:type="spellStart"/>
+            <w:r>
+              <w:rPr>
+                <w:rFonts w:ascii="맑은 고딕" w:eastAsia="맑은 고딕" w:hAnsi="맑은 고딕" w:cs="맑은 고딕"/>
+                <w:color w:val="333333"/>
+                <w:sz w:val="18"/>
+                <w:szCs w:val="18"/>
+              </w:rPr>
+              <w:t>티커</w:t>
+            </w:r>
+            <w:proofErr w:type="spellEnd"/>
+            <w:r>
+              <w:rPr>
+                <w:rFonts w:ascii="맑은 고딕" w:eastAsia="맑은 고딕" w:hAnsi="맑은 고딕" w:cs="맑은 고딕"/>
+                <w:color w:val="333333"/>
+                <w:sz w:val="18"/>
+                <w:szCs w:val="18"/>
+              </w:rPr>
+              <w:t xml:space="preserve"> 기반 영문 뉴스 (Reuters, Bloomberg, CNBC 등)</w:t>
             </w:r>
           </w:p>
         </w:tc>
@@ -6160,15 +6104,80 @@
             <w:pPr>
               <w:spacing w:after="0" w:line="280" w:lineRule="auto"/>
               <w:jc w:val="center"/>
-            </w:pPr>
-            <w:r>
               <w:rPr>
                 <w:rFonts w:ascii="맑은 고딕" w:eastAsia="맑은 고딕" w:hAnsi="맑은 고딕" w:cs="맑은 고딕"/>
                 <w:color w:val="333333"/>
                 <w:sz w:val="18"/>
                 <w:szCs w:val="18"/>
               </w:rPr>
-              <w:t>네이버 검색 API</w:t>
+            </w:pPr>
+            <w:r>
+              <w:rPr>
+                <w:rFonts w:ascii="맑은 고딕" w:eastAsia="맑은 고딕" w:hAnsi="맑은 고딕" w:cs="맑은 고딕"/>
+                <w:color w:val="333333"/>
+                <w:sz w:val="18"/>
+                <w:szCs w:val="18"/>
+              </w:rPr>
+              <w:t>NewsData.io</w:t>
+            </w:r>
+          </w:p>
+          <w:p>
+            <w:pPr>
+              <w:spacing w:after="0" w:line="280" w:lineRule="auto"/>
+              <w:jc w:val="center"/>
+            </w:pPr>
+            <w:proofErr w:type="spellStart"/>
+            <w:r>
+              <w:rPr>
+                <w:rFonts w:ascii="맑은 고딕" w:eastAsia="맑은 고딕" w:hAnsi="맑은 고딕" w:cs="맑은 고딕" w:hint="eastAsia"/>
+                <w:sz w:val="18"/>
+                <w:szCs w:val="18"/>
+              </w:rPr>
+              <w:t>G</w:t>
+            </w:r>
+            <w:r>
+              <w:rPr>
+                <w:rFonts w:ascii="맑은 고딕" w:eastAsia="맑은 고딕" w:hAnsi="맑은 고딕" w:cs="맑은 고딕"/>
+                <w:sz w:val="18"/>
+                <w:szCs w:val="18"/>
+              </w:rPr>
+              <w:t>news</w:t>
+            </w:r>
+            <w:proofErr w:type="spellEnd"/>
+          </w:p>
+          <w:p>
+            <w:pPr>
+              <w:spacing w:after="0" w:line="280" w:lineRule="auto"/>
+              <w:jc w:val="center"/>
+            </w:pPr>
+            <w:r>
+              <w:rPr>
+                <w:rFonts w:ascii="맑은 고딕" w:eastAsia="맑은 고딕" w:hAnsi="맑은 고딕" w:cs="맑은 고딕"/>
+                <w:color w:val="333333"/>
+                <w:sz w:val="18"/>
+                <w:szCs w:val="18"/>
+              </w:rPr>
+              <w:t xml:space="preserve">(또는 </w:t>
+            </w:r>
+            <w:proofErr w:type="spellStart"/>
+            <w:r>
+              <w:rPr>
+                <w:rFonts w:ascii="맑은 고딕" w:eastAsia="맑은 고딕" w:hAnsi="맑은 고딕" w:cs="맑은 고딕"/>
+                <w:color w:val="333333"/>
+                <w:sz w:val="18"/>
+                <w:szCs w:val="18"/>
+              </w:rPr>
+              <w:t>yfinance</w:t>
+            </w:r>
+            <w:proofErr w:type="spellEnd"/>
+            <w:r>
+              <w:rPr>
+                <w:rFonts w:ascii="맑은 고딕" w:eastAsia="맑은 고딕" w:hAnsi="맑은 고딕" w:cs="맑은 고딕"/>
+                <w:color w:val="333333"/>
+                <w:sz w:val="18"/>
+                <w:szCs w:val="18"/>
+              </w:rPr>
+              <w:t xml:space="preserve"> 내장)</w:t>
             </w:r>
           </w:p>
         </w:tc>
@@ -6217,7 +6226,7 @@
                 <w:sz w:val="18"/>
                 <w:szCs w:val="18"/>
               </w:rPr>
-              <w:t>(일 25,000회 무료)</w:t>
+              <w:t>(일 200 credits 무료)</w:t>
             </w:r>
           </w:p>
         </w:tc>
@@ -6250,18 +6259,32 @@
                 <w:sz w:val="18"/>
                 <w:szCs w:val="18"/>
               </w:rPr>
-              <w:t>한국 종목 상세 페이지 뉴스 탭</w:t>
+              <w:t xml:space="preserve">미국 종목 상세 페이지, 글로벌 </w:t>
+            </w:r>
+            <w:proofErr w:type="spellStart"/>
+            <w:r>
+              <w:rPr>
+                <w:rFonts w:ascii="맑은 고딕" w:eastAsia="맑은 고딕" w:hAnsi="맑은 고딕" w:cs="맑은 고딕"/>
+                <w:color w:val="333333"/>
+                <w:sz w:val="18"/>
+                <w:szCs w:val="18"/>
+              </w:rPr>
+              <w:t>트렌딩</w:t>
+            </w:r>
+            <w:proofErr w:type="spellEnd"/>
+            <w:r>
+              <w:rPr>
+                <w:rFonts w:ascii="맑은 고딕" w:eastAsia="맑은 고딕" w:hAnsi="맑은 고딕" w:cs="맑은 고딕"/>
+                <w:color w:val="333333"/>
+                <w:sz w:val="18"/>
+                <w:szCs w:val="18"/>
+              </w:rPr>
+              <w:t xml:space="preserve"> 키워드</w:t>
             </w:r>
           </w:p>
         </w:tc>
       </w:tr>
       <w:tr>
-        <w:tblPrEx>
-          <w:tblCellMar>
-            <w:top w:w="0" w:type="dxa"/>
-            <w:bottom w:w="0" w:type="dxa"/>
-          </w:tblCellMar>
-        </w:tblPrEx>
         <w:trPr>
           <w:jc w:val="center"/>
         </w:trPr>
@@ -6297,7 +6320,7 @@
                 <w:sz w:val="18"/>
                 <w:szCs w:val="18"/>
               </w:rPr>
-              <w:t>미국 종목 영문 뉴스</w:t>
+              <w:t>종목 위험성향 분류</w:t>
             </w:r>
           </w:p>
         </w:tc>
@@ -6330,7 +6353,7 @@
                 <w:sz w:val="18"/>
                 <w:szCs w:val="18"/>
               </w:rPr>
-              <w:t xml:space="preserve">미국 </w:t>
+              <w:t xml:space="preserve">종목별 베타 계수, 변동성, </w:t>
             </w:r>
             <w:proofErr w:type="spellStart"/>
             <w:r>
@@ -6340,7 +6363,7 @@
                 <w:sz w:val="18"/>
                 <w:szCs w:val="18"/>
               </w:rPr>
-              <w:t>종목명</w:t>
+              <w:t>최대낙폭</w:t>
             </w:r>
             <w:proofErr w:type="spellEnd"/>
             <w:r>
@@ -6350,27 +6373,7 @@
                 <w:sz w:val="18"/>
                 <w:szCs w:val="18"/>
               </w:rPr>
-              <w:t>/</w:t>
-            </w:r>
-            <w:proofErr w:type="spellStart"/>
-            <w:r>
-              <w:rPr>
-                <w:rFonts w:ascii="맑은 고딕" w:eastAsia="맑은 고딕" w:hAnsi="맑은 고딕" w:cs="맑은 고딕"/>
-                <w:color w:val="333333"/>
-                <w:sz w:val="18"/>
-                <w:szCs w:val="18"/>
-              </w:rPr>
-              <w:t>티커</w:t>
-            </w:r>
-            <w:proofErr w:type="spellEnd"/>
-            <w:r>
-              <w:rPr>
-                <w:rFonts w:ascii="맑은 고딕" w:eastAsia="맑은 고딕" w:hAnsi="맑은 고딕" w:cs="맑은 고딕"/>
-                <w:color w:val="333333"/>
-                <w:sz w:val="18"/>
-                <w:szCs w:val="18"/>
-              </w:rPr>
-              <w:t xml:space="preserve"> 기반 영문 뉴스 (Reuters, Bloomberg, CNBC 등)</w:t>
+              <w:t>(MDD) 기반 위험 등급 (안정/균형/공격)</w:t>
             </w:r>
           </w:p>
         </w:tc>
@@ -6404,7 +6407,7 @@
                 <w:sz w:val="18"/>
                 <w:szCs w:val="18"/>
               </w:rPr>
-              <w:t>NewsData.io</w:t>
+              <w:t>자체 계산</w:t>
             </w:r>
           </w:p>
           <w:p>
@@ -6419,27 +6422,7 @@
                 <w:sz w:val="18"/>
                 <w:szCs w:val="18"/>
               </w:rPr>
-              <w:t xml:space="preserve">(또는 </w:t>
-            </w:r>
-            <w:proofErr w:type="spellStart"/>
-            <w:r>
-              <w:rPr>
-                <w:rFonts w:ascii="맑은 고딕" w:eastAsia="맑은 고딕" w:hAnsi="맑은 고딕" w:cs="맑은 고딕"/>
-                <w:color w:val="333333"/>
-                <w:sz w:val="18"/>
-                <w:szCs w:val="18"/>
-              </w:rPr>
-              <w:t>yfinance</w:t>
-            </w:r>
-            <w:proofErr w:type="spellEnd"/>
-            <w:r>
-              <w:rPr>
-                <w:rFonts w:ascii="맑은 고딕" w:eastAsia="맑은 고딕" w:hAnsi="맑은 고딕" w:cs="맑은 고딕"/>
-                <w:color w:val="333333"/>
-                <w:sz w:val="18"/>
-                <w:szCs w:val="18"/>
-              </w:rPr>
-              <w:t xml:space="preserve"> 내장)</w:t>
+              <w:t>(시세 데이터 기반)</w:t>
             </w:r>
           </w:p>
         </w:tc>
@@ -6473,7 +6456,7 @@
                 <w:sz w:val="18"/>
                 <w:szCs w:val="18"/>
               </w:rPr>
-              <w:t>REST API</w:t>
+              <w:t>Python 알고리즘</w:t>
             </w:r>
           </w:p>
           <w:p>
@@ -6488,7 +6471,7 @@
                 <w:sz w:val="18"/>
                 <w:szCs w:val="18"/>
               </w:rPr>
-              <w:t>(일 200 credits 무료)</w:t>
+              <w:t>(시세 데이터 활용)</w:t>
             </w:r>
           </w:p>
         </w:tc>
@@ -6514,6 +6497,7 @@
             <w:pPr>
               <w:spacing w:after="0" w:line="280" w:lineRule="auto"/>
             </w:pPr>
+            <w:proofErr w:type="spellStart"/>
             <w:r>
               <w:rPr>
                 <w:rFonts w:ascii="맑은 고딕" w:eastAsia="맑은 고딕" w:hAnsi="맑은 고딕" w:cs="맑은 고딕"/>
@@ -6521,9 +6505,9 @@
                 <w:sz w:val="18"/>
                 <w:szCs w:val="18"/>
               </w:rPr>
-              <w:t xml:space="preserve">미국 종목 상세 페이지, 글로벌 </w:t>
-            </w:r>
-            <w:proofErr w:type="spellStart"/>
+              <w:t>룰렛</w:t>
+            </w:r>
+            <w:proofErr w:type="spellEnd"/>
             <w:r>
               <w:rPr>
                 <w:rFonts w:ascii="맑은 고딕" w:eastAsia="맑은 고딕" w:hAnsi="맑은 고딕" w:cs="맑은 고딕"/>
@@ -6531,9 +6515,9 @@
                 <w:sz w:val="18"/>
                 <w:szCs w:val="18"/>
               </w:rPr>
-              <w:t>트렌딩</w:t>
-            </w:r>
-            <w:proofErr w:type="spellEnd"/>
+              <w:t xml:space="preserve"> 추천 (위험성향 매칭), 사용자 </w:t>
+            </w:r>
+            <w:proofErr w:type="spellStart"/>
             <w:r>
               <w:rPr>
                 <w:rFonts w:ascii="맑은 고딕" w:eastAsia="맑은 고딕" w:hAnsi="맑은 고딕" w:cs="맑은 고딕"/>
@@ -6541,18 +6525,22 @@
                 <w:sz w:val="18"/>
                 <w:szCs w:val="18"/>
               </w:rPr>
-              <w:t xml:space="preserve"> 키워드</w:t>
+              <w:t>성향별</w:t>
+            </w:r>
+            <w:proofErr w:type="spellEnd"/>
+            <w:r>
+              <w:rPr>
+                <w:rFonts w:ascii="맑은 고딕" w:eastAsia="맑은 고딕" w:hAnsi="맑은 고딕" w:cs="맑은 고딕"/>
+                <w:color w:val="333333"/>
+                <w:sz w:val="18"/>
+                <w:szCs w:val="18"/>
+              </w:rPr>
+              <w:t xml:space="preserve"> 필터링</w:t>
             </w:r>
           </w:p>
         </w:tc>
       </w:tr>
       <w:tr>
-        <w:tblPrEx>
-          <w:tblCellMar>
-            <w:top w:w="0" w:type="dxa"/>
-            <w:bottom w:w="0" w:type="dxa"/>
-          </w:tblCellMar>
-        </w:tblPrEx>
         <w:trPr>
           <w:jc w:val="center"/>
         </w:trPr>
@@ -6588,7 +6576,7 @@
                 <w:sz w:val="18"/>
                 <w:szCs w:val="18"/>
               </w:rPr>
-              <w:t>종목 위험성향 분류</w:t>
+              <w:t>사용자 행동 데이터</w:t>
             </w:r>
           </w:p>
         </w:tc>
@@ -6614,6 +6602,7 @@
             <w:pPr>
               <w:spacing w:after="0" w:line="280" w:lineRule="auto"/>
             </w:pPr>
+            <w:proofErr w:type="spellStart"/>
             <w:r>
               <w:rPr>
                 <w:rFonts w:ascii="맑은 고딕" w:eastAsia="맑은 고딕" w:hAnsi="맑은 고딕" w:cs="맑은 고딕"/>
@@ -6621,9 +6610,9 @@
                 <w:sz w:val="18"/>
                 <w:szCs w:val="18"/>
               </w:rPr>
-              <w:t xml:space="preserve">종목별 베타 계수, 변동성, </w:t>
-            </w:r>
-            <w:proofErr w:type="spellStart"/>
+              <w:t>스와이프</w:t>
+            </w:r>
+            <w:proofErr w:type="spellEnd"/>
             <w:r>
               <w:rPr>
                 <w:rFonts w:ascii="맑은 고딕" w:eastAsia="맑은 고딕" w:hAnsi="맑은 고딕" w:cs="맑은 고딕"/>
@@ -6631,9 +6620,9 @@
                 <w:sz w:val="18"/>
                 <w:szCs w:val="18"/>
               </w:rPr>
-              <w:t>최대낙폭</w:t>
-            </w:r>
-            <w:proofErr w:type="spellEnd"/>
+              <w:t xml:space="preserve"> 좋아요/패스 기록, </w:t>
+            </w:r>
+            <w:proofErr w:type="spellStart"/>
             <w:r>
               <w:rPr>
                 <w:rFonts w:ascii="맑은 고딕" w:eastAsia="맑은 고딕" w:hAnsi="맑은 고딕" w:cs="맑은 고딕"/>
@@ -6641,7 +6630,17 @@
                 <w:sz w:val="18"/>
                 <w:szCs w:val="18"/>
               </w:rPr>
-              <w:t>(MDD) 기반 위험 등급 (안정/균형/공격)</w:t>
+              <w:t>워치리스트</w:t>
+            </w:r>
+            <w:proofErr w:type="spellEnd"/>
+            <w:r>
+              <w:rPr>
+                <w:rFonts w:ascii="맑은 고딕" w:eastAsia="맑은 고딕" w:hAnsi="맑은 고딕" w:cs="맑은 고딕"/>
+                <w:color w:val="333333"/>
+                <w:sz w:val="18"/>
+                <w:szCs w:val="18"/>
+              </w:rPr>
+              <w:t>, 일기 작성 이력</w:t>
             </w:r>
           </w:p>
         </w:tc>
@@ -6675,22 +6674,7 @@
                 <w:sz w:val="18"/>
                 <w:szCs w:val="18"/>
               </w:rPr>
-              <w:t>자체 계산</w:t>
-            </w:r>
-          </w:p>
-          <w:p>
-            <w:pPr>
-              <w:spacing w:after="0" w:line="280" w:lineRule="auto"/>
-              <w:jc w:val="center"/>
-            </w:pPr>
-            <w:r>
-              <w:rPr>
-                <w:rFonts w:ascii="맑은 고딕" w:eastAsia="맑은 고딕" w:hAnsi="맑은 고딕" w:cs="맑은 고딕"/>
-                <w:color w:val="333333"/>
-                <w:sz w:val="18"/>
-                <w:szCs w:val="18"/>
-              </w:rPr>
-              <w:t>(시세 데이터 기반)</w:t>
+              <w:t>자체 DB</w:t>
             </w:r>
           </w:p>
         </w:tc>
@@ -6724,7 +6708,7 @@
                 <w:sz w:val="18"/>
                 <w:szCs w:val="18"/>
               </w:rPr>
-              <w:t>Python 알고리즘</w:t>
+              <w:t>서비스 내 수집</w:t>
             </w:r>
           </w:p>
           <w:p>
@@ -6739,7 +6723,7 @@
                 <w:sz w:val="18"/>
                 <w:szCs w:val="18"/>
               </w:rPr>
-              <w:t>(시세 데이터 활용)</w:t>
+              <w:t>(PostgreSQL 적재)</w:t>
             </w:r>
           </w:p>
         </w:tc>
@@ -6765,7 +6749,6 @@
             <w:pPr>
               <w:spacing w:after="0" w:line="280" w:lineRule="auto"/>
             </w:pPr>
-            <w:proofErr w:type="spellStart"/>
             <w:r>
               <w:rPr>
                 <w:rFonts w:ascii="맑은 고딕" w:eastAsia="맑은 고딕" w:hAnsi="맑은 고딕" w:cs="맑은 고딕"/>
@@ -6773,49 +6756,14 @@
                 <w:sz w:val="18"/>
                 <w:szCs w:val="18"/>
               </w:rPr>
-              <w:t>룰렛</w:t>
-            </w:r>
-            <w:proofErr w:type="spellEnd"/>
-            <w:r>
-              <w:rPr>
-                <w:rFonts w:ascii="맑은 고딕" w:eastAsia="맑은 고딕" w:hAnsi="맑은 고딕" w:cs="맑은 고딕"/>
-                <w:color w:val="333333"/>
-                <w:sz w:val="18"/>
-                <w:szCs w:val="18"/>
-              </w:rPr>
-              <w:t xml:space="preserve"> 추천 (위험성향 매칭), 사용자 </w:t>
-            </w:r>
-            <w:proofErr w:type="spellStart"/>
-            <w:r>
-              <w:rPr>
-                <w:rFonts w:ascii="맑은 고딕" w:eastAsia="맑은 고딕" w:hAnsi="맑은 고딕" w:cs="맑은 고딕"/>
-                <w:color w:val="333333"/>
-                <w:sz w:val="18"/>
-                <w:szCs w:val="18"/>
-              </w:rPr>
-              <w:t>성향별</w:t>
-            </w:r>
-            <w:proofErr w:type="spellEnd"/>
-            <w:r>
-              <w:rPr>
-                <w:rFonts w:ascii="맑은 고딕" w:eastAsia="맑은 고딕" w:hAnsi="맑은 고딕" w:cs="맑은 고딕"/>
-                <w:color w:val="333333"/>
-                <w:sz w:val="18"/>
-                <w:szCs w:val="18"/>
-              </w:rPr>
-              <w:t xml:space="preserve"> 필터링</w:t>
+              <w:t>협업 필터링 추천, 개인화 알고리즘 학습</w:t>
             </w:r>
           </w:p>
         </w:tc>
       </w:tr>
       <w:tr>
-        <w:tblPrEx>
-          <w:tblCellMar>
-            <w:top w:w="0" w:type="dxa"/>
-            <w:bottom w:w="0" w:type="dxa"/>
-          </w:tblCellMar>
-        </w:tblPrEx>
         <w:trPr>
+          <w:trHeight w:val="15"/>
           <w:jc w:val="center"/>
         </w:trPr>
         <w:tc>
@@ -6850,7 +6798,7 @@
                 <w:sz w:val="18"/>
                 <w:szCs w:val="18"/>
               </w:rPr>
-              <w:t>사용자 행동 데이터</w:t>
+              <w:t>AI 분석 결과 데이터</w:t>
             </w:r>
           </w:p>
         </w:tc>
@@ -6876,7 +6824,6 @@
             <w:pPr>
               <w:spacing w:after="0" w:line="280" w:lineRule="auto"/>
             </w:pPr>
-            <w:proofErr w:type="spellStart"/>
             <w:r>
               <w:rPr>
                 <w:rFonts w:ascii="맑은 고딕" w:eastAsia="맑은 고딕" w:hAnsi="맑은 고딕" w:cs="맑은 고딕"/>
@@ -6884,9 +6831,9 @@
                 <w:sz w:val="18"/>
                 <w:szCs w:val="18"/>
               </w:rPr>
-              <w:t>스와이프</w:t>
-            </w:r>
-            <w:proofErr w:type="spellEnd"/>
+              <w:t xml:space="preserve">사용자 일기 텍스트 분석 (투자 성향, 매수 동기), 종목 </w:t>
+            </w:r>
+            <w:proofErr w:type="spellStart"/>
             <w:r>
               <w:rPr>
                 <w:rFonts w:ascii="맑은 고딕" w:eastAsia="맑은 고딕" w:hAnsi="맑은 고딕" w:cs="맑은 고딕"/>
@@ -6894,9 +6841,9 @@
                 <w:sz w:val="18"/>
                 <w:szCs w:val="18"/>
               </w:rPr>
-              <w:t xml:space="preserve"> 좋아요/패스 기록, </w:t>
-            </w:r>
-            <w:proofErr w:type="spellStart"/>
+              <w:t>한줄</w:t>
+            </w:r>
+            <w:proofErr w:type="spellEnd"/>
             <w:r>
               <w:rPr>
                 <w:rFonts w:ascii="맑은 고딕" w:eastAsia="맑은 고딕" w:hAnsi="맑은 고딕" w:cs="맑은 고딕"/>
@@ -6904,17 +6851,7 @@
                 <w:sz w:val="18"/>
                 <w:szCs w:val="18"/>
               </w:rPr>
-              <w:t>워치리스트</w:t>
-            </w:r>
-            <w:proofErr w:type="spellEnd"/>
-            <w:r>
-              <w:rPr>
-                <w:rFonts w:ascii="맑은 고딕" w:eastAsia="맑은 고딕" w:hAnsi="맑은 고딕" w:cs="맑은 고딕"/>
-                <w:color w:val="333333"/>
-                <w:sz w:val="18"/>
-                <w:szCs w:val="18"/>
-              </w:rPr>
-              <w:t>, 일기 작성 이력</w:t>
+              <w:t xml:space="preserve"> 설명 자동 생성</w:t>
             </w:r>
           </w:p>
         </w:tc>
@@ -6941,6 +6878,7 @@
               <w:spacing w:after="0" w:line="280" w:lineRule="auto"/>
               <w:jc w:val="center"/>
             </w:pPr>
+            <w:proofErr w:type="spellStart"/>
             <w:r>
               <w:rPr>
                 <w:rFonts w:ascii="맑은 고딕" w:eastAsia="맑은 고딕" w:hAnsi="맑은 고딕" w:cs="맑은 고딕"/>
@@ -6948,7 +6886,32 @@
                 <w:sz w:val="18"/>
                 <w:szCs w:val="18"/>
               </w:rPr>
-              <w:t>자체 DB</w:t>
+              <w:t>OpenAI</w:t>
+            </w:r>
+            <w:proofErr w:type="spellEnd"/>
+            <w:r>
+              <w:rPr>
+                <w:rFonts w:ascii="맑은 고딕" w:eastAsia="맑은 고딕" w:hAnsi="맑은 고딕" w:cs="맑은 고딕"/>
+                <w:color w:val="333333"/>
+                <w:sz w:val="18"/>
+                <w:szCs w:val="18"/>
+              </w:rPr>
+              <w:t xml:space="preserve"> API</w:t>
+            </w:r>
+          </w:p>
+          <w:p>
+            <w:pPr>
+              <w:spacing w:after="0" w:line="280" w:lineRule="auto"/>
+              <w:jc w:val="center"/>
+            </w:pPr>
+            <w:r>
+              <w:rPr>
+                <w:rFonts w:ascii="맑은 고딕" w:eastAsia="맑은 고딕" w:hAnsi="맑은 고딕" w:cs="맑은 고딕"/>
+                <w:color w:val="333333"/>
+                <w:sz w:val="18"/>
+                <w:szCs w:val="18"/>
+              </w:rPr>
+              <w:t>(GPT)</w:t>
             </w:r>
           </w:p>
         </w:tc>
@@ -6982,22 +6945,7 @@
                 <w:sz w:val="18"/>
                 <w:szCs w:val="18"/>
               </w:rPr>
-              <w:t>서비스 내 수집</w:t>
-            </w:r>
-          </w:p>
-          <w:p>
-            <w:pPr>
-              <w:spacing w:after="0" w:line="280" w:lineRule="auto"/>
-              <w:jc w:val="center"/>
-            </w:pPr>
-            <w:r>
-              <w:rPr>
-                <w:rFonts w:ascii="맑은 고딕" w:eastAsia="맑은 고딕" w:hAnsi="맑은 고딕" w:cs="맑은 고딕"/>
-                <w:color w:val="333333"/>
-                <w:sz w:val="18"/>
-                <w:szCs w:val="18"/>
-              </w:rPr>
-              <w:t>(PostgreSQL 적재)</w:t>
+              <w:t>REST API</w:t>
             </w:r>
           </w:p>
         </w:tc>
@@ -7030,234 +6978,6 @@
                 <w:sz w:val="18"/>
                 <w:szCs w:val="18"/>
               </w:rPr>
-              <w:t>협업 필터링 추천, 개인화 알고리즘 학습</w:t>
-            </w:r>
-          </w:p>
-        </w:tc>
-      </w:tr>
-      <w:tr>
-        <w:tblPrEx>
-          <w:tblCellMar>
-            <w:top w:w="0" w:type="dxa"/>
-            <w:bottom w:w="0" w:type="dxa"/>
-          </w:tblCellMar>
-        </w:tblPrEx>
-        <w:trPr>
-          <w:trHeight w:val="15"/>
-          <w:jc w:val="center"/>
-        </w:trPr>
-        <w:tc>
-          <w:tcPr>
-            <w:tcW w:w="1700" w:type="dxa"/>
-            <w:tcBorders>
-              <w:top w:val="single" w:sz="4" w:space="0" w:color="BFBFBF"/>
-              <w:left w:val="single" w:sz="4" w:space="0" w:color="BFBFBF"/>
-              <w:bottom w:val="single" w:sz="4" w:space="0" w:color="BFBFBF"/>
-              <w:right w:val="single" w:sz="4" w:space="0" w:color="BFBFBF"/>
-            </w:tcBorders>
-            <w:shd w:val="clear" w:color="auto" w:fill="FFFFFF"/>
-            <w:tcMar>
-              <w:top w:w="100" w:type="dxa"/>
-              <w:left w:w="120" w:type="dxa"/>
-              <w:bottom w:w="100" w:type="dxa"/>
-              <w:right w:w="120" w:type="dxa"/>
-            </w:tcMar>
-            <w:vAlign w:val="center"/>
-          </w:tcPr>
-          <w:p>
-            <w:pPr>
-              <w:spacing w:after="0" w:line="280" w:lineRule="auto"/>
-              <w:jc w:val="center"/>
-            </w:pPr>
-            <w:r>
-              <w:rPr>
-                <w:rFonts w:ascii="맑은 고딕" w:eastAsia="맑은 고딕" w:hAnsi="맑은 고딕" w:cs="맑은 고딕"/>
-                <w:b/>
-                <w:bCs/>
-                <w:color w:val="333333"/>
-                <w:sz w:val="18"/>
-                <w:szCs w:val="18"/>
-              </w:rPr>
-              <w:t>AI 분석 결과 데이터</w:t>
-            </w:r>
-          </w:p>
-        </w:tc>
-        <w:tc>
-          <w:tcPr>
-            <w:tcW w:w="2400" w:type="dxa"/>
-            <w:tcBorders>
-              <w:top w:val="single" w:sz="4" w:space="0" w:color="BFBFBF"/>
-              <w:left w:val="single" w:sz="4" w:space="0" w:color="BFBFBF"/>
-              <w:bottom w:val="single" w:sz="4" w:space="0" w:color="BFBFBF"/>
-              <w:right w:val="single" w:sz="4" w:space="0" w:color="BFBFBF"/>
-            </w:tcBorders>
-            <w:shd w:val="clear" w:color="auto" w:fill="FFFFFF"/>
-            <w:tcMar>
-              <w:top w:w="100" w:type="dxa"/>
-              <w:left w:w="120" w:type="dxa"/>
-              <w:bottom w:w="100" w:type="dxa"/>
-              <w:right w:w="120" w:type="dxa"/>
-            </w:tcMar>
-            <w:vAlign w:val="center"/>
-          </w:tcPr>
-          <w:p>
-            <w:pPr>
-              <w:spacing w:after="0" w:line="280" w:lineRule="auto"/>
-            </w:pPr>
-            <w:r>
-              <w:rPr>
-                <w:rFonts w:ascii="맑은 고딕" w:eastAsia="맑은 고딕" w:hAnsi="맑은 고딕" w:cs="맑은 고딕"/>
-                <w:color w:val="333333"/>
-                <w:sz w:val="18"/>
-                <w:szCs w:val="18"/>
-              </w:rPr>
-              <w:t xml:space="preserve">사용자 일기 텍스트 분석 (투자 성향, 매수 동기), 종목 </w:t>
-            </w:r>
-            <w:proofErr w:type="spellStart"/>
-            <w:r>
-              <w:rPr>
-                <w:rFonts w:ascii="맑은 고딕" w:eastAsia="맑은 고딕" w:hAnsi="맑은 고딕" w:cs="맑은 고딕"/>
-                <w:color w:val="333333"/>
-                <w:sz w:val="18"/>
-                <w:szCs w:val="18"/>
-              </w:rPr>
-              <w:t>한줄</w:t>
-            </w:r>
-            <w:proofErr w:type="spellEnd"/>
-            <w:r>
-              <w:rPr>
-                <w:rFonts w:ascii="맑은 고딕" w:eastAsia="맑은 고딕" w:hAnsi="맑은 고딕" w:cs="맑은 고딕"/>
-                <w:color w:val="333333"/>
-                <w:sz w:val="18"/>
-                <w:szCs w:val="18"/>
-              </w:rPr>
-              <w:t xml:space="preserve"> 설명 자동 생성</w:t>
-            </w:r>
-          </w:p>
-        </w:tc>
-        <w:tc>
-          <w:tcPr>
-            <w:tcW w:w="1500" w:type="dxa"/>
-            <w:tcBorders>
-              <w:top w:val="single" w:sz="4" w:space="0" w:color="BFBFBF"/>
-              <w:left w:val="single" w:sz="4" w:space="0" w:color="BFBFBF"/>
-              <w:bottom w:val="single" w:sz="4" w:space="0" w:color="BFBFBF"/>
-              <w:right w:val="single" w:sz="4" w:space="0" w:color="BFBFBF"/>
-            </w:tcBorders>
-            <w:shd w:val="clear" w:color="auto" w:fill="FFFFFF"/>
-            <w:tcMar>
-              <w:top w:w="100" w:type="dxa"/>
-              <w:left w:w="120" w:type="dxa"/>
-              <w:bottom w:w="100" w:type="dxa"/>
-              <w:right w:w="120" w:type="dxa"/>
-            </w:tcMar>
-            <w:vAlign w:val="center"/>
-          </w:tcPr>
-          <w:p>
-            <w:pPr>
-              <w:spacing w:after="0" w:line="280" w:lineRule="auto"/>
-              <w:jc w:val="center"/>
-            </w:pPr>
-            <w:proofErr w:type="spellStart"/>
-            <w:r>
-              <w:rPr>
-                <w:rFonts w:ascii="맑은 고딕" w:eastAsia="맑은 고딕" w:hAnsi="맑은 고딕" w:cs="맑은 고딕"/>
-                <w:color w:val="333333"/>
-                <w:sz w:val="18"/>
-                <w:szCs w:val="18"/>
-              </w:rPr>
-              <w:t>OpenAI</w:t>
-            </w:r>
-            <w:proofErr w:type="spellEnd"/>
-            <w:r>
-              <w:rPr>
-                <w:rFonts w:ascii="맑은 고딕" w:eastAsia="맑은 고딕" w:hAnsi="맑은 고딕" w:cs="맑은 고딕"/>
-                <w:color w:val="333333"/>
-                <w:sz w:val="18"/>
-                <w:szCs w:val="18"/>
-              </w:rPr>
-              <w:t xml:space="preserve"> API</w:t>
-            </w:r>
-          </w:p>
-          <w:p>
-            <w:pPr>
-              <w:spacing w:after="0" w:line="280" w:lineRule="auto"/>
-              <w:jc w:val="center"/>
-            </w:pPr>
-            <w:r>
-              <w:rPr>
-                <w:rFonts w:ascii="맑은 고딕" w:eastAsia="맑은 고딕" w:hAnsi="맑은 고딕" w:cs="맑은 고딕"/>
-                <w:color w:val="333333"/>
-                <w:sz w:val="18"/>
-                <w:szCs w:val="18"/>
-              </w:rPr>
-              <w:t>(GPT)</w:t>
-            </w:r>
-          </w:p>
-        </w:tc>
-        <w:tc>
-          <w:tcPr>
-            <w:tcW w:w="1500" w:type="dxa"/>
-            <w:tcBorders>
-              <w:top w:val="single" w:sz="4" w:space="0" w:color="BFBFBF"/>
-              <w:left w:val="single" w:sz="4" w:space="0" w:color="BFBFBF"/>
-              <w:bottom w:val="single" w:sz="4" w:space="0" w:color="BFBFBF"/>
-              <w:right w:val="single" w:sz="4" w:space="0" w:color="BFBFBF"/>
-            </w:tcBorders>
-            <w:shd w:val="clear" w:color="auto" w:fill="FFFFFF"/>
-            <w:tcMar>
-              <w:top w:w="100" w:type="dxa"/>
-              <w:left w:w="120" w:type="dxa"/>
-              <w:bottom w:w="100" w:type="dxa"/>
-              <w:right w:w="120" w:type="dxa"/>
-            </w:tcMar>
-            <w:vAlign w:val="center"/>
-          </w:tcPr>
-          <w:p>
-            <w:pPr>
-              <w:spacing w:after="0" w:line="280" w:lineRule="auto"/>
-              <w:jc w:val="center"/>
-            </w:pPr>
-            <w:r>
-              <w:rPr>
-                <w:rFonts w:ascii="맑은 고딕" w:eastAsia="맑은 고딕" w:hAnsi="맑은 고딕" w:cs="맑은 고딕"/>
-                <w:color w:val="333333"/>
-                <w:sz w:val="18"/>
-                <w:szCs w:val="18"/>
-              </w:rPr>
-              <w:t>REST API</w:t>
-            </w:r>
-          </w:p>
-        </w:tc>
-        <w:tc>
-          <w:tcPr>
-            <w:tcW w:w="1926" w:type="dxa"/>
-            <w:tcBorders>
-              <w:top w:val="single" w:sz="4" w:space="0" w:color="BFBFBF"/>
-              <w:left w:val="single" w:sz="4" w:space="0" w:color="BFBFBF"/>
-              <w:bottom w:val="single" w:sz="4" w:space="0" w:color="BFBFBF"/>
-              <w:right w:val="single" w:sz="4" w:space="0" w:color="BFBFBF"/>
-            </w:tcBorders>
-            <w:shd w:val="clear" w:color="auto" w:fill="FFFFFF"/>
-            <w:tcMar>
-              <w:top w:w="100" w:type="dxa"/>
-              <w:left w:w="120" w:type="dxa"/>
-              <w:bottom w:w="100" w:type="dxa"/>
-              <w:right w:w="120" w:type="dxa"/>
-            </w:tcMar>
-            <w:vAlign w:val="center"/>
-          </w:tcPr>
-          <w:p>
-            <w:pPr>
-              <w:spacing w:after="0" w:line="280" w:lineRule="auto"/>
-            </w:pPr>
-            <w:r>
-              <w:rPr>
-                <w:rFonts w:ascii="맑은 고딕" w:eastAsia="맑은 고딕" w:hAnsi="맑은 고딕" w:cs="맑은 고딕"/>
-                <w:color w:val="333333"/>
-                <w:sz w:val="18"/>
-                <w:szCs w:val="18"/>
-              </w:rPr>
               <w:t xml:space="preserve">투자 MBTI 리포트, 종목 카드 </w:t>
             </w:r>
             <w:proofErr w:type="spellStart"/>
@@ -7324,7 +7044,6 @@
           <w:sz w:val="40"/>
           <w:szCs w:val="40"/>
         </w:rPr>
-        <w:lastRenderedPageBreak/>
         <w:t xml:space="preserve">4. </w:t>
       </w:r>
       <w:r>
@@ -7375,6 +7094,24 @@
         </w:rPr>
         <w:t>RD</w:t>
       </w:r>
+      <w:r>
+        <w:rPr>
+          <w:rFonts w:ascii="맑은 고딕" w:eastAsia="맑은 고딕" w:hAnsi="맑은 고딕" w:cs="맑은 고딕"/>
+          <w:b/>
+          <w:bCs/>
+          <w:sz w:val="22"/>
+        </w:rPr>
+        <w:t xml:space="preserve"> </w:t>
+      </w:r>
+      <w:r>
+        <w:rPr>
+          <w:rFonts w:ascii="맑은 고딕" w:eastAsia="맑은 고딕" w:hAnsi="맑은 고딕" w:cs="맑은 고딕" w:hint="eastAsia"/>
+          <w:b/>
+          <w:bCs/>
+          <w:sz w:val="22"/>
+        </w:rPr>
+        <w:t>아래가 수정본</w:t>
+      </w:r>
     </w:p>
     <w:p>
       <w:pPr>
@@ -7382,7 +7119,6 @@
         <w:spacing w:after="0"/>
         <w:ind w:left="510" w:hanging="510"/>
         <w:rPr>
-          <w:rFonts w:hint="eastAsia"/>
           <w:b/>
           <w:bCs/>
           <w:sz w:val="40"/>
@@ -7397,6 +7133,7 @@
           <w:sz w:val="40"/>
           <w:szCs w:val="40"/>
         </w:rPr>
+        <w:lastRenderedPageBreak/>
         <w:drawing>
           <wp:inline distT="0" distB="0" distL="0" distR="0" wp14:anchorId="37BA31E0" wp14:editId="0A1C7DD8">
             <wp:extent cx="5695036" cy="1732240"/>
@@ -7448,7 +7185,58 @@
       <w:pPr>
         <w:spacing w:before="200" w:after="100"/>
         <w:rPr>
-          <w:rFonts w:ascii="맑은 고딕" w:eastAsia="맑은 고딕" w:hAnsi="맑은 고딕" w:cs="맑은 고딕" w:hint="eastAsia"/>
+          <w:rFonts w:ascii="맑은 고딕" w:eastAsia="맑은 고딕" w:hAnsi="맑은 고딕" w:cs="맑은 고딕"/>
+          <w:b/>
+          <w:bCs/>
+          <w:sz w:val="22"/>
+        </w:rPr>
+      </w:pPr>
+      <w:r>
+        <w:rPr>
+          <w:noProof/>
+        </w:rPr>
+        <w:drawing>
+          <wp:inline distT="0" distB="0" distL="0" distR="0" wp14:anchorId="0617401F" wp14:editId="46F1D3C0">
+            <wp:extent cx="5731510" cy="3768090"/>
+            <wp:effectExtent l="0" t="0" r="2540" b="3810"/>
+            <wp:docPr id="3" name="그림 3"/>
+            <wp:cNvGraphicFramePr>
+              <a:graphicFrameLocks xmlns:a="http://schemas.openxmlformats.org/drawingml/2006/main" noChangeAspect="1"/>
+            </wp:cNvGraphicFramePr>
+            <a:graphic xmlns:a="http://schemas.openxmlformats.org/drawingml/2006/main">
+              <a:graphicData uri="http://schemas.openxmlformats.org/drawingml/2006/picture">
+                <pic:pic xmlns:pic="http://schemas.openxmlformats.org/drawingml/2006/picture">
+                  <pic:nvPicPr>
+                    <pic:cNvPr id="1" name=""/>
+                    <pic:cNvPicPr/>
+                  </pic:nvPicPr>
+                  <pic:blipFill>
+                    <a:blip r:embed="rId14"/>
+                    <a:stretch>
+                      <a:fillRect/>
+                    </a:stretch>
+                  </pic:blipFill>
+                  <pic:spPr>
+                    <a:xfrm>
+                      <a:off x="0" y="0"/>
+                      <a:ext cx="5731510" cy="3768090"/>
+                    </a:xfrm>
+                    <a:prstGeom prst="rect">
+                      <a:avLst/>
+                    </a:prstGeom>
+                  </pic:spPr>
+                </pic:pic>
+              </a:graphicData>
+            </a:graphic>
+          </wp:inline>
+        </w:drawing>
+      </w:r>
+    </w:p>
+    <w:p>
+      <w:pPr>
+        <w:spacing w:before="200" w:after="100"/>
+        <w:rPr>
+          <w:rFonts w:ascii="맑은 고딕" w:eastAsia="맑은 고딕" w:hAnsi="맑은 고딕" w:cs="맑은 고딕"/>
           <w:b/>
           <w:bCs/>
           <w:sz w:val="22"/>
@@ -7461,6 +7249,16 @@
           <w:bCs/>
           <w:sz w:val="22"/>
         </w:rPr>
+        <w:br w:type="column"/>
+      </w:r>
+      <w:r>
+        <w:rPr>
+          <w:rFonts w:ascii="맑은 고딕" w:eastAsia="맑은 고딕" w:hAnsi="맑은 고딕" w:cs="맑은 고딕"/>
+          <w:b/>
+          <w:bCs/>
+          <w:sz w:val="22"/>
+        </w:rPr>
+        <w:lastRenderedPageBreak/>
         <w:t xml:space="preserve">2. </w:t>
       </w:r>
       <w:r>
@@ -7479,7 +7277,6 @@
         <w:spacing w:after="0"/>
         <w:ind w:left="510" w:hanging="510"/>
         <w:rPr>
-          <w:rFonts w:hint="eastAsia"/>
           <w:sz w:val="22"/>
         </w:rPr>
       </w:pPr>
@@ -7506,7 +7303,7 @@
                     </pic:cNvPicPr>
                   </pic:nvPicPr>
                   <pic:blipFill>
-                    <a:blip r:embed="rId14">
+                    <a:blip r:embed="rId15">
                       <a:extLst>
                         <a:ext uri="{28A0092B-C50C-407E-A947-70E740481C1C}">
                           <a14:useLocalDpi xmlns:a14="http://schemas.microsoft.com/office/drawing/2010/main" val="0"/>
@@ -7563,7 +7360,6 @@
           <w:sz w:val="40"/>
           <w:szCs w:val="40"/>
         </w:rPr>
-        <w:lastRenderedPageBreak/>
         <w:t xml:space="preserve">5. </w:t>
       </w:r>
       <w:r>
@@ -7582,7 +7378,6 @@
         <w:wordWrap/>
         <w:spacing w:after="0"/>
         <w:rPr>
-          <w:rFonts w:hint="eastAsia"/>
           <w:sz w:val="22"/>
         </w:rPr>
       </w:pPr>
@@ -7954,6 +7749,7 @@
                 <w:kern w:val="0"/>
                 <w:szCs w:val="20"/>
               </w:rPr>
+              <w:lastRenderedPageBreak/>
               <w:t>회원가입 페이지</w:t>
             </w:r>
           </w:p>
@@ -8824,7 +8620,6 @@
         <w:spacing w:after="0"/>
         <w:jc w:val="left"/>
         <w:rPr>
-          <w:rFonts w:hint="eastAsia"/>
           <w:sz w:val="22"/>
         </w:rPr>
       </w:pPr>
@@ -8836,7 +8631,6 @@
         <w:autoSpaceDE/>
         <w:autoSpaceDN/>
         <w:rPr>
-          <w:rFonts w:hint="eastAsia"/>
           <w:sz w:val="22"/>
         </w:rPr>
       </w:pPr>
@@ -8899,7 +8693,7 @@
                     </pic:cNvPicPr>
                   </pic:nvPicPr>
                   <pic:blipFill>
-                    <a:blip r:embed="rId15" cstate="print">
+                    <a:blip r:embed="rId16" cstate="print">
                       <a:extLst>
                         <a:ext uri="{28A0092B-C50C-407E-A947-70E740481C1C}">
                           <a14:useLocalDpi xmlns:a14="http://schemas.microsoft.com/office/drawing/2010/main" val="0"/>
@@ -8981,7 +8775,7 @@
                     </pic:cNvPicPr>
                   </pic:nvPicPr>
                   <pic:blipFill>
-                    <a:blip r:embed="rId16" cstate="print">
+                    <a:blip r:embed="rId17" cstate="print">
                       <a:extLst>
                         <a:ext uri="{28A0092B-C50C-407E-A947-70E740481C1C}">
                           <a14:useLocalDpi xmlns:a14="http://schemas.microsoft.com/office/drawing/2010/main" val="0"/>
@@ -9048,7 +8842,6 @@
         <w:ind w:leftChars="0" w:left="624"/>
         <w:jc w:val="left"/>
         <w:rPr>
-          <w:rFonts w:hint="eastAsia"/>
           <w:sz w:val="22"/>
         </w:rPr>
       </w:pPr>
@@ -9074,7 +8867,7 @@
                     </pic:cNvPicPr>
                   </pic:nvPicPr>
                   <pic:blipFill>
-                    <a:blip r:embed="rId17" cstate="print">
+                    <a:blip r:embed="rId18" cstate="print">
                       <a:extLst>
                         <a:ext uri="{28A0092B-C50C-407E-A947-70E740481C1C}">
                           <a14:useLocalDpi xmlns:a14="http://schemas.microsoft.com/office/drawing/2010/main" val="0"/>
@@ -14461,10 +14254,6 @@
 </file>
 
 <file path=customXml/item1.xml><?xml version="1.0" encoding="utf-8"?>
-<b:Sources xmlns:b="http://schemas.openxmlformats.org/officeDocument/2006/bibliography" xmlns="http://schemas.openxmlformats.org/officeDocument/2006/bibliography" SelectedStyle="\APASixthEditionOfficeOnline.xsl" StyleName="APA" Version="6"/>
-</file>
-
-<file path=customXml/item2.xml><?xml version="1.0" encoding="utf-8"?>
 <ct:contentTypeSchema xmlns:ct="http://schemas.microsoft.com/office/2006/metadata/contentType" xmlns:ma="http://schemas.microsoft.com/office/2006/metadata/properties/metaAttributes" ct:_="" ma:_="" ma:contentTypeName="Document" ma:contentTypeID="0x010100F013B4BD8A056C4790386A6040E7CFD1" ma:contentTypeVersion="15" ma:contentTypeDescription="Create a new document." ma:contentTypeScope="" ma:versionID="8a45206c59e5d22a870d8ebc96b36625">
   <xsd:schema xmlns:xsd="http://www.w3.org/2001/XMLSchema" xmlns:xs="http://www.w3.org/2001/XMLSchema" xmlns:p="http://schemas.microsoft.com/office/2006/metadata/properties" xmlns:ns2="8ac307eb-12d9-434d-8280-a47ce07b356d" xmlns:ns3="8f805e87-c28d-4de3-9cfd-97861b2d07b7" targetNamespace="http://schemas.microsoft.com/office/2006/metadata/properties" ma:root="true" ma:fieldsID="80c78afa7fe026f4f36a4c1521804eab" ns2:_="" ns3:_="">
     <xsd:import namespace="8ac307eb-12d9-434d-8280-a47ce07b356d"/>
@@ -14699,16 +14488,11 @@
 </ct:contentTypeSchema>
 </file>
 
-<file path=customXml/item3.xml><?xml version="1.0" encoding="utf-8"?>
-<?mso-contentType ?>
-<FormTemplates xmlns="http://schemas.microsoft.com/sharepoint/v3/contenttype/forms">
-  <Display>DocumentLibraryForm</Display>
-  <Edit>DocumentLibraryForm</Edit>
-  <New>DocumentLibraryForm</New>
-</FormTemplates>
+<file path=customXml/item2.xml><?xml version="1.0" encoding="utf-8"?>
+<b:Sources xmlns:b="http://schemas.openxmlformats.org/officeDocument/2006/bibliography" xmlns="http://schemas.openxmlformats.org/officeDocument/2006/bibliography" SelectedStyle="\APASixthEditionOfficeOnline.xsl" StyleName="APA" Version="6"/>
 </file>
 
-<file path=customXml/item4.xml><?xml version="1.0" encoding="utf-8"?>
+<file path=customXml/item3.xml><?xml version="1.0" encoding="utf-8"?>
 <p:properties xmlns:p="http://schemas.microsoft.com/office/2006/metadata/properties" xmlns:xsi="http://www.w3.org/2001/XMLSchema-instance" xmlns:pc="http://schemas.microsoft.com/office/infopath/2007/PartnerControls">
   <documentManagement>
     <TaxCatchAll xmlns="8f805e87-c28d-4de3-9cfd-97861b2d07b7" xsi:nil="true"/>
@@ -14720,15 +14504,16 @@
 </p:properties>
 </file>
 
-<file path=customXml/itemProps1.xml><?xml version="1.0" encoding="utf-8"?>
-<ds:datastoreItem xmlns:ds="http://schemas.openxmlformats.org/officeDocument/2006/customXml" ds:itemID="{DBA50451-FB17-4AFF-ACEF-D3036A315410}">
-  <ds:schemaRefs>
-    <ds:schemaRef ds:uri="http://schemas.openxmlformats.org/officeDocument/2006/bibliography"/>
-  </ds:schemaRefs>
-</ds:datastoreItem>
+<file path=customXml/item4.xml><?xml version="1.0" encoding="utf-8"?>
+<?mso-contentType ?>
+<FormTemplates xmlns="http://schemas.microsoft.com/sharepoint/v3/contenttype/forms">
+  <Display>DocumentLibraryForm</Display>
+  <Edit>DocumentLibraryForm</Edit>
+  <New>DocumentLibraryForm</New>
+</FormTemplates>
 </file>
 
-<file path=customXml/itemProps2.xml><?xml version="1.0" encoding="utf-8"?>
+<file path=customXml/itemProps1.xml><?xml version="1.0" encoding="utf-8"?>
 <ds:datastoreItem xmlns:ds="http://schemas.openxmlformats.org/officeDocument/2006/customXml" ds:itemID="{8925F1DA-F05B-4DE0-8924-F74DE99990F6}">
   <ds:schemaRefs>
     <ds:schemaRef ds:uri="http://schemas.microsoft.com/office/2006/metadata/contentType"/>
@@ -14747,15 +14532,15 @@
 </ds:datastoreItem>
 </file>
 
-<file path=customXml/itemProps3.xml><?xml version="1.0" encoding="utf-8"?>
-<ds:datastoreItem xmlns:ds="http://schemas.openxmlformats.org/officeDocument/2006/customXml" ds:itemID="{76BDC03C-BB59-450B-A5F4-477303CA8210}">
+<file path=customXml/itemProps2.xml><?xml version="1.0" encoding="utf-8"?>
+<ds:datastoreItem xmlns:ds="http://schemas.openxmlformats.org/officeDocument/2006/customXml" ds:itemID="{DBA50451-FB17-4AFF-ACEF-D3036A315410}">
   <ds:schemaRefs>
-    <ds:schemaRef ds:uri="http://schemas.microsoft.com/sharepoint/v3/contenttype/forms"/>
+    <ds:schemaRef ds:uri="http://schemas.openxmlformats.org/officeDocument/2006/bibliography"/>
   </ds:schemaRefs>
 </ds:datastoreItem>
 </file>
 
-<file path=customXml/itemProps4.xml><?xml version="1.0" encoding="utf-8"?>
+<file path=customXml/itemProps3.xml><?xml version="1.0" encoding="utf-8"?>
 <ds:datastoreItem xmlns:ds="http://schemas.openxmlformats.org/officeDocument/2006/customXml" ds:itemID="{714B3644-6C03-46E6-999C-8786D19B5D73}">
   <ds:schemaRefs>
     <ds:schemaRef ds:uri="http://schemas.microsoft.com/office/2006/metadata/properties"/>
@@ -14764,4 +14549,12 @@
     <ds:schemaRef ds:uri="8ac307eb-12d9-434d-8280-a47ce07b356d"/>
   </ds:schemaRefs>
 </ds:datastoreItem>
+</file>
+
+<file path=customXml/itemProps4.xml><?xml version="1.0" encoding="utf-8"?>
+<ds:datastoreItem xmlns:ds="http://schemas.openxmlformats.org/officeDocument/2006/customXml" ds:itemID="{76BDC03C-BB59-450B-A5F4-477303CA8210}">
+  <ds:schemaRefs>
+    <ds:schemaRef ds:uri="http://schemas.microsoft.com/sharepoint/v3/contenttype/forms"/>
+  </ds:schemaRefs>
+</ds:datastoreItem>
 </file>
</xml_diff>

<commit_message>
Revert "Title: feat(stocks): STOCK 마스터 적재 management command [SCRUM-58]"
</commit_message>
<xml_diff>
--- a/jumanchu/planning/광주1반_6조_주만추.docx
+++ b/jumanchu/planning/광주1반_6조_주만추.docx
@@ -8,6 +8,7 @@
         <w:spacing w:after="0"/>
         <w:jc w:val="left"/>
         <w:rPr>
+          <w:rFonts w:hint="eastAsia"/>
           <w:b/>
           <w:bCs/>
           <w:sz w:val="40"/>
@@ -282,145 +283,7 @@
                 <w:kern w:val="0"/>
                 <w:szCs w:val="20"/>
               </w:rPr>
-              <w:t xml:space="preserve"> 위한 주식투자 서비스</w:t>
-            </w:r>
-          </w:p>
-          <w:p>
-            <w:pPr>
-              <w:pStyle w:val="a4"/>
-              <w:wordWrap/>
-              <w:ind w:leftChars="0" w:left="0"/>
-              <w:rPr>
-                <w:rFonts w:asciiTheme="majorEastAsia" w:eastAsiaTheme="majorEastAsia" w:hAnsiTheme="majorEastAsia" w:cs="AppleSDGothicNeo-Regular"/>
-                <w:b/>
-                <w:bCs/>
-                <w:kern w:val="0"/>
-                <w:szCs w:val="20"/>
-              </w:rPr>
-            </w:pPr>
-            <w:r>
-              <w:rPr>
-                <w:rFonts w:asciiTheme="majorEastAsia" w:eastAsiaTheme="majorEastAsia" w:hAnsiTheme="majorEastAsia" w:cs="AppleSDGothicNeo-Regular"/>
-                <w:b/>
-                <w:bCs/>
-                <w:kern w:val="0"/>
-                <w:szCs w:val="20"/>
-              </w:rPr>
-              <w:t>(</w:t>
-            </w:r>
-            <w:r>
-              <w:rPr>
-                <w:rFonts w:asciiTheme="majorEastAsia" w:eastAsiaTheme="majorEastAsia" w:hAnsiTheme="majorEastAsia" w:cs="AppleSDGothicNeo-Regular" w:hint="eastAsia"/>
-                <w:b/>
-                <w:bCs/>
-                <w:kern w:val="0"/>
-                <w:szCs w:val="20"/>
-              </w:rPr>
-              <w:t xml:space="preserve">장기투자 </w:t>
-            </w:r>
-            <w:proofErr w:type="gramStart"/>
-            <w:r>
-              <w:rPr>
-                <w:rFonts w:asciiTheme="majorEastAsia" w:eastAsiaTheme="majorEastAsia" w:hAnsiTheme="majorEastAsia" w:cs="AppleSDGothicNeo-Regular" w:hint="eastAsia"/>
-                <w:b/>
-                <w:bCs/>
-                <w:kern w:val="0"/>
-                <w:szCs w:val="20"/>
-              </w:rPr>
-              <w:t xml:space="preserve">지향 </w:t>
-            </w:r>
-            <w:r>
-              <w:rPr>
-                <w:rFonts w:asciiTheme="majorEastAsia" w:eastAsiaTheme="majorEastAsia" w:hAnsiTheme="majorEastAsia" w:cs="AppleSDGothicNeo-Regular"/>
-                <w:b/>
-                <w:bCs/>
-                <w:kern w:val="0"/>
-                <w:szCs w:val="20"/>
-              </w:rPr>
-              <w:t>/</w:t>
-            </w:r>
-            <w:proofErr w:type="gramEnd"/>
-            <w:r>
-              <w:rPr>
-                <w:rFonts w:asciiTheme="majorEastAsia" w:eastAsiaTheme="majorEastAsia" w:hAnsiTheme="majorEastAsia" w:cs="AppleSDGothicNeo-Regular"/>
-                <w:b/>
-                <w:bCs/>
-                <w:kern w:val="0"/>
-                <w:szCs w:val="20"/>
-              </w:rPr>
-              <w:t xml:space="preserve"> </w:t>
-            </w:r>
-            <w:r>
-              <w:rPr>
-                <w:rFonts w:asciiTheme="majorEastAsia" w:eastAsiaTheme="majorEastAsia" w:hAnsiTheme="majorEastAsia" w:cs="AppleSDGothicNeo-Regular" w:hint="eastAsia"/>
-                <w:b/>
-                <w:bCs/>
-                <w:kern w:val="0"/>
-                <w:szCs w:val="20"/>
-              </w:rPr>
-              <w:t>단기투자 지양)</w:t>
-            </w:r>
-            <w:r>
-              <w:rPr>
-                <w:rFonts w:asciiTheme="majorEastAsia" w:eastAsiaTheme="majorEastAsia" w:hAnsiTheme="majorEastAsia" w:cs="AppleSDGothicNeo-Regular"/>
-                <w:b/>
-                <w:bCs/>
-                <w:kern w:val="0"/>
-                <w:szCs w:val="20"/>
-              </w:rPr>
-              <w:t xml:space="preserve"> </w:t>
-            </w:r>
-            <w:r>
-              <w:rPr>
-                <w:rFonts w:asciiTheme="majorEastAsia" w:eastAsiaTheme="majorEastAsia" w:hAnsiTheme="majorEastAsia" w:cs="AppleSDGothicNeo-Regular" w:hint="eastAsia"/>
-                <w:b/>
-                <w:bCs/>
-                <w:kern w:val="0"/>
-                <w:szCs w:val="20"/>
-              </w:rPr>
-              <w:t>방향성 제공,</w:t>
-            </w:r>
-            <w:r>
-              <w:rPr>
-                <w:rFonts w:asciiTheme="majorEastAsia" w:eastAsiaTheme="majorEastAsia" w:hAnsiTheme="majorEastAsia" w:cs="AppleSDGothicNeo-Regular"/>
-                <w:b/>
-                <w:bCs/>
-                <w:kern w:val="0"/>
-                <w:szCs w:val="20"/>
-              </w:rPr>
-              <w:t xml:space="preserve"> </w:t>
-            </w:r>
-            <w:r>
-              <w:rPr>
-                <w:rFonts w:asciiTheme="majorEastAsia" w:eastAsiaTheme="majorEastAsia" w:hAnsiTheme="majorEastAsia" w:cs="AppleSDGothicNeo-Regular" w:hint="eastAsia"/>
-                <w:b/>
-                <w:bCs/>
-                <w:kern w:val="0"/>
-                <w:szCs w:val="20"/>
-              </w:rPr>
-              <w:t xml:space="preserve">옵션은 </w:t>
-            </w:r>
-            <w:proofErr w:type="spellStart"/>
-            <w:r>
-              <w:rPr>
-                <w:rFonts w:asciiTheme="majorEastAsia" w:eastAsiaTheme="majorEastAsia" w:hAnsiTheme="majorEastAsia" w:cs="AppleSDGothicNeo-Regular" w:hint="eastAsia"/>
-                <w:b/>
-                <w:bCs/>
-                <w:kern w:val="0"/>
-                <w:szCs w:val="20"/>
-              </w:rPr>
-              <w:t>열어둠</w:t>
-            </w:r>
-            <w:proofErr w:type="spellEnd"/>
-            <w:r>
-              <w:rPr>
-                <w:rFonts w:asciiTheme="majorEastAsia" w:eastAsiaTheme="majorEastAsia" w:hAnsiTheme="majorEastAsia" w:cs="AppleSDGothicNeo-Regular" w:hint="eastAsia"/>
-                <w:b/>
-                <w:bCs/>
-                <w:kern w:val="0"/>
-                <w:szCs w:val="20"/>
-              </w:rPr>
-              <w:t xml:space="preserve"> </w:t>
+              <w:t xml:space="preserve"> 위한 주식투자 서비스 </w:t>
             </w:r>
           </w:p>
         </w:tc>
@@ -747,19 +610,11 @@
                 <w:szCs w:val="20"/>
               </w:rPr>
             </w:pPr>
-            <w:proofErr w:type="gramStart"/>
-            <w:r>
-              <w:rPr>
-                <w:szCs w:val="20"/>
-              </w:rPr>
-              <w:t>홈 /</w:t>
-            </w:r>
-            <w:proofErr w:type="gramEnd"/>
-            <w:r>
-              <w:rPr>
-                <w:szCs w:val="20"/>
-              </w:rPr>
-              <w:t xml:space="preserve"> </w:t>
+            <w:r>
+              <w:rPr>
+                <w:szCs w:val="20"/>
+              </w:rPr>
+              <w:t xml:space="preserve">홈 / </w:t>
             </w:r>
             <w:r>
               <w:rPr>
@@ -4120,23 +3975,7 @@
           <w:rFonts w:ascii="맑은 고딕" w:eastAsia="맑은 고딕" w:hAnsi="맑은 고딕" w:cs="맑은 고딕"/>
           <w:sz w:val="22"/>
         </w:rPr>
-        <w:t>2026-05-11 (월) ~ 2026-06-25 (목</w:t>
-      </w:r>
-      <w:proofErr w:type="gramStart"/>
-      <w:r>
-        <w:rPr>
-          <w:rFonts w:ascii="맑은 고딕" w:eastAsia="맑은 고딕" w:hAnsi="맑은 고딕" w:cs="맑은 고딕"/>
-          <w:sz w:val="22"/>
-        </w:rPr>
-        <w:t>)  |</w:t>
-      </w:r>
-      <w:proofErr w:type="gramEnd"/>
-      <w:r>
-        <w:rPr>
-          <w:rFonts w:ascii="맑은 고딕" w:eastAsia="맑은 고딕" w:hAnsi="맑은 고딕" w:cs="맑은 고딕"/>
-          <w:sz w:val="22"/>
-        </w:rPr>
-        <w:t xml:space="preserve">  마감: 6/20  |  발표: 6/25</w:t>
+        <w:t>2026-05-11 (월) ~ 2026-06-25 (목)  |  마감: 6/20  |  발표: 6/25</w:t>
       </w:r>
     </w:p>
     <w:p>
@@ -7222,7 +7061,7 @@
       <w:pPr>
         <w:spacing w:before="200" w:after="100"/>
         <w:rPr>
-          <w:rFonts w:ascii="맑은 고딕" w:eastAsia="맑은 고딕" w:hAnsi="맑은 고딕" w:cs="맑은 고딕"/>
+          <w:rFonts w:ascii="맑은 고딕" w:eastAsia="맑은 고딕" w:hAnsi="맑은 고딕" w:cs="맑은 고딕" w:hint="eastAsia"/>
           <w:b/>
           <w:bCs/>
           <w:sz w:val="22"/>
@@ -14415,10 +14254,6 @@
 </file>
 
 <file path=customXml/item1.xml><?xml version="1.0" encoding="utf-8"?>
-<b:Sources xmlns:b="http://schemas.openxmlformats.org/officeDocument/2006/bibliography" xmlns="http://schemas.openxmlformats.org/officeDocument/2006/bibliography" SelectedStyle="\APASixthEditionOfficeOnline.xsl" StyleName="APA" Version="6"/>
-</file>
-
-<file path=customXml/item2.xml><?xml version="1.0" encoding="utf-8"?>
 <ct:contentTypeSchema xmlns:ct="http://schemas.microsoft.com/office/2006/metadata/contentType" xmlns:ma="http://schemas.microsoft.com/office/2006/metadata/properties/metaAttributes" ct:_="" ma:_="" ma:contentTypeName="Document" ma:contentTypeID="0x010100F013B4BD8A056C4790386A6040E7CFD1" ma:contentTypeVersion="15" ma:contentTypeDescription="Create a new document." ma:contentTypeScope="" ma:versionID="8a45206c59e5d22a870d8ebc96b36625">
   <xsd:schema xmlns:xsd="http://www.w3.org/2001/XMLSchema" xmlns:xs="http://www.w3.org/2001/XMLSchema" xmlns:p="http://schemas.microsoft.com/office/2006/metadata/properties" xmlns:ns2="8ac307eb-12d9-434d-8280-a47ce07b356d" xmlns:ns3="8f805e87-c28d-4de3-9cfd-97861b2d07b7" targetNamespace="http://schemas.microsoft.com/office/2006/metadata/properties" ma:root="true" ma:fieldsID="80c78afa7fe026f4f36a4c1521804eab" ns2:_="" ns3:_="">
     <xsd:import namespace="8ac307eb-12d9-434d-8280-a47ce07b356d"/>
@@ -14653,16 +14488,11 @@
 </ct:contentTypeSchema>
 </file>
 
-<file path=customXml/item3.xml><?xml version="1.0" encoding="utf-8"?>
-<?mso-contentType ?>
-<FormTemplates xmlns="http://schemas.microsoft.com/sharepoint/v3/contenttype/forms">
-  <Display>DocumentLibraryForm</Display>
-  <Edit>DocumentLibraryForm</Edit>
-  <New>DocumentLibraryForm</New>
-</FormTemplates>
+<file path=customXml/item2.xml><?xml version="1.0" encoding="utf-8"?>
+<b:Sources xmlns:b="http://schemas.openxmlformats.org/officeDocument/2006/bibliography" xmlns="http://schemas.openxmlformats.org/officeDocument/2006/bibliography" SelectedStyle="\APASixthEditionOfficeOnline.xsl" StyleName="APA" Version="6"/>
 </file>
 
-<file path=customXml/item4.xml><?xml version="1.0" encoding="utf-8"?>
+<file path=customXml/item3.xml><?xml version="1.0" encoding="utf-8"?>
 <p:properties xmlns:p="http://schemas.microsoft.com/office/2006/metadata/properties" xmlns:xsi="http://www.w3.org/2001/XMLSchema-instance" xmlns:pc="http://schemas.microsoft.com/office/infopath/2007/PartnerControls">
   <documentManagement>
     <TaxCatchAll xmlns="8f805e87-c28d-4de3-9cfd-97861b2d07b7" xsi:nil="true"/>
@@ -14674,15 +14504,16 @@
 </p:properties>
 </file>
 
-<file path=customXml/itemProps1.xml><?xml version="1.0" encoding="utf-8"?>
-<ds:datastoreItem xmlns:ds="http://schemas.openxmlformats.org/officeDocument/2006/customXml" ds:itemID="{DBA50451-FB17-4AFF-ACEF-D3036A315410}">
-  <ds:schemaRefs>
-    <ds:schemaRef ds:uri="http://schemas.openxmlformats.org/officeDocument/2006/bibliography"/>
-  </ds:schemaRefs>
-</ds:datastoreItem>
+<file path=customXml/item4.xml><?xml version="1.0" encoding="utf-8"?>
+<?mso-contentType ?>
+<FormTemplates xmlns="http://schemas.microsoft.com/sharepoint/v3/contenttype/forms">
+  <Display>DocumentLibraryForm</Display>
+  <Edit>DocumentLibraryForm</Edit>
+  <New>DocumentLibraryForm</New>
+</FormTemplates>
 </file>
 
-<file path=customXml/itemProps2.xml><?xml version="1.0" encoding="utf-8"?>
+<file path=customXml/itemProps1.xml><?xml version="1.0" encoding="utf-8"?>
 <ds:datastoreItem xmlns:ds="http://schemas.openxmlformats.org/officeDocument/2006/customXml" ds:itemID="{8925F1DA-F05B-4DE0-8924-F74DE99990F6}">
   <ds:schemaRefs>
     <ds:schemaRef ds:uri="http://schemas.microsoft.com/office/2006/metadata/contentType"/>
@@ -14701,15 +14532,15 @@
 </ds:datastoreItem>
 </file>
 
-<file path=customXml/itemProps3.xml><?xml version="1.0" encoding="utf-8"?>
-<ds:datastoreItem xmlns:ds="http://schemas.openxmlformats.org/officeDocument/2006/customXml" ds:itemID="{76BDC03C-BB59-450B-A5F4-477303CA8210}">
+<file path=customXml/itemProps2.xml><?xml version="1.0" encoding="utf-8"?>
+<ds:datastoreItem xmlns:ds="http://schemas.openxmlformats.org/officeDocument/2006/customXml" ds:itemID="{DBA50451-FB17-4AFF-ACEF-D3036A315410}">
   <ds:schemaRefs>
-    <ds:schemaRef ds:uri="http://schemas.microsoft.com/sharepoint/v3/contenttype/forms"/>
+    <ds:schemaRef ds:uri="http://schemas.openxmlformats.org/officeDocument/2006/bibliography"/>
   </ds:schemaRefs>
 </ds:datastoreItem>
 </file>
 
-<file path=customXml/itemProps4.xml><?xml version="1.0" encoding="utf-8"?>
+<file path=customXml/itemProps3.xml><?xml version="1.0" encoding="utf-8"?>
 <ds:datastoreItem xmlns:ds="http://schemas.openxmlformats.org/officeDocument/2006/customXml" ds:itemID="{714B3644-6C03-46E6-999C-8786D19B5D73}">
   <ds:schemaRefs>
     <ds:schemaRef ds:uri="http://schemas.microsoft.com/office/2006/metadata/properties"/>
@@ -14718,4 +14549,12 @@
     <ds:schemaRef ds:uri="8ac307eb-12d9-434d-8280-a47ce07b356d"/>
   </ds:schemaRefs>
 </ds:datastoreItem>
+</file>
+
+<file path=customXml/itemProps4.xml><?xml version="1.0" encoding="utf-8"?>
+<ds:datastoreItem xmlns:ds="http://schemas.openxmlformats.org/officeDocument/2006/customXml" ds:itemID="{76BDC03C-BB59-450B-A5F4-477303CA8210}">
+  <ds:schemaRefs>
+    <ds:schemaRef ds:uri="http://schemas.microsoft.com/sharepoint/v3/contenttype/forms"/>
+  </ds:schemaRefs>
+</ds:datastoreItem>
 </file>
</xml_diff>